<commit_message>
Give the storyboard PDF a white page so the colour swatches stay readable.
Co-authored-by: Cursor <cursoragent@cursor.com>
</commit_message>
<xml_diff>
--- a/Articulate assets/Storyboard Master/Portfolio sample_Before you paste classify.docx
+++ b/Articulate assets/Storyboard Master/Portfolio sample_Before you paste classify.docx
@@ -1,7 +1,7 @@
 
 <file path=word/document.xml><?xml version="1.0" encoding="utf-8"?>
 <w:document xmlns:wpc="http://schemas.microsoft.com/office/word/2010/wordprocessingCanvas" xmlns:cx="http://schemas.microsoft.com/office/drawing/2014/chartex" xmlns:cx1="http://schemas.microsoft.com/office/drawing/2015/9/8/chartex" xmlns:cx2="http://schemas.microsoft.com/office/drawing/2015/10/21/chartex" xmlns:cx3="http://schemas.microsoft.com/office/drawing/2016/5/9/chartex" xmlns:cx4="http://schemas.microsoft.com/office/drawing/2016/5/10/chartex" xmlns:cx5="http://schemas.microsoft.com/office/drawing/2016/5/11/chartex" xmlns:cx6="http://schemas.microsoft.com/office/drawing/2016/5/12/chartex" xmlns:cx7="http://schemas.microsoft.com/office/drawing/2016/5/13/chartex" xmlns:cx8="http://schemas.microsoft.com/office/drawing/2016/5/14/chartex" xmlns:mc="http://schemas.openxmlformats.org/markup-compatibility/2006" xmlns:aink="http://schemas.microsoft.com/office/drawing/2016/ink" xmlns:am3d="http://schemas.microsoft.com/office/drawing/2017/model3d" xmlns:o="urn:schemas-microsoft-com:office:office" xmlns:oel="http://schemas.microsoft.com/office/2019/extlst" xmlns:r="http://schemas.openxmlformats.org/officeDocument/2006/relationships" xmlns:m="http://schemas.openxmlformats.org/officeDocument/2006/math" xmlns:v="urn:schemas-microsoft-com:vml" xmlns:wp14="http://schemas.microsoft.com/office/word/2010/wordprocessingDrawing" xmlns:wp="http://schemas.openxmlformats.org/drawingml/2006/wordprocessingDrawing" xmlns:w10="urn:schemas-microsoft-com:office:word" xmlns:w="http://schemas.openxmlformats.org/wordprocessingml/2006/main" xmlns:w14="http://schemas.microsoft.com/office/word/2010/wordml" xmlns:w15="http://schemas.microsoft.com/office/word/2012/wordml" xmlns:w16cex="http://schemas.microsoft.com/office/word/2018/wordml/cex" xmlns:w16cid="http://schemas.microsoft.com/office/word/2016/wordml/cid" xmlns:w16="http://schemas.microsoft.com/office/word/2018/wordml" xmlns:w16du="http://schemas.microsoft.com/office/word/2023/wordml/word16du" xmlns:w16sdtdh="http://schemas.microsoft.com/office/word/2020/wordml/sdtdatahash" xmlns:w16sdtfl="http://schemas.microsoft.com/office/word/2024/wordml/sdtformatlock" xmlns:w16se="http://schemas.microsoft.com/office/word/2015/wordml/symex" xmlns:wpg="http://schemas.microsoft.com/office/word/2010/wordprocessingGroup" xmlns:wpi="http://schemas.microsoft.com/office/word/2010/wordprocessingInk" xmlns:wne="http://schemas.microsoft.com/office/word/2006/wordml" xmlns:wps="http://schemas.microsoft.com/office/word/2010/wordprocessingShape" mc:Ignorable="w14 w15 w16se w16cid w16 w16cex w16sdtdh w16sdtfl w16du wp14">
-  <w:background w:color="E6E6E6"/>
+  <w:background w:color="FFFFFF"/>
   <w:body>
     <w:p>
       <w:pPr>
@@ -1718,14 +1718,6 @@
                 <w:szCs w:val="28"/>
               </w:rPr>
               <w:br/>
-            </w:r>
-            <w:r>
-              <w:rPr>
-                <w:rFonts w:ascii="Calibri" w:eastAsia="Times New Roman" w:hAnsi="Calibri" w:cs="Calibri"/>
-                <w:color w:val="3B3B3B"/>
-                <w:sz w:val="28"/>
-                <w:szCs w:val="28"/>
-              </w:rPr>
               <w:t>Type (learner-facing): Open Sauce One 400/500/600 and League Gothic Regular. Install on Windows before trial week. Embed on publish.</w:t>
             </w:r>
             <w:r>
@@ -2076,7 +2068,6 @@
         <w:rPr>
           <w:lang w:val="en"/>
         </w:rPr>
-        <w:lastRenderedPageBreak/>
         <w:t>Rise 360 · 1.0</w:t>
       </w:r>
     </w:p>
@@ -2800,14 +2791,6 @@
                 <w:szCs w:val="28"/>
               </w:rPr>
               <w:br/>
-            </w:r>
-            <w:r>
-              <w:rPr>
-                <w:rFonts w:ascii="Calibri" w:eastAsia="Times New Roman" w:hAnsi="Calibri" w:cs="Calibri"/>
-                <w:color w:val="3B3B3B"/>
-                <w:sz w:val="28"/>
-                <w:szCs w:val="28"/>
-              </w:rPr>
               <w:t>Remote work is fast. Public AI tools and personal drives are faster still. This module is not a policy lecture. It is the 30-second habit your team needs before client text, staff data, or unpublished files leave an approved system.</w:t>
             </w:r>
           </w:p>
@@ -2914,7 +2897,6 @@
           <w:color w:val="3B3B3B"/>
           <w:lang w:val="en"/>
         </w:rPr>
-        <w:lastRenderedPageBreak/>
         <w:t> </w:t>
       </w:r>
     </w:p>
@@ -3737,7 +3719,6 @@
         <w:rPr>
           <w:lang w:val="en"/>
         </w:rPr>
-        <w:lastRenderedPageBreak/>
         <w:t>Rise 360 · 2.1</w:t>
       </w:r>
     </w:p>
@@ -4470,14 +4451,6 @@
                 <w:szCs w:val="28"/>
               </w:rPr>
               <w:br/>
-            </w:r>
-            <w:r>
-              <w:rPr>
-                <w:rFonts w:ascii="Calibri" w:eastAsia="Times New Roman" w:hAnsi="Calibri" w:cs="Calibri"/>
-                <w:color w:val="3B3B3B"/>
-                <w:sz w:val="28"/>
-                <w:szCs w:val="28"/>
-              </w:rPr>
               <w:t>Harmless working text — public AI is fine.</w:t>
             </w:r>
           </w:p>
@@ -4584,7 +4557,6 @@
           <w:color w:val="3B3B3B"/>
           <w:lang w:val="en"/>
         </w:rPr>
-        <w:lastRenderedPageBreak/>
         <w:t> </w:t>
       </w:r>
     </w:p>
@@ -5436,7 +5408,6 @@
         <w:rPr>
           <w:lang w:val="en"/>
         </w:rPr>
-        <w:lastRenderedPageBreak/>
         <w:t>Rise 360 · 3.2</w:t>
       </w:r>
     </w:p>
@@ -6243,7 +6214,6 @@
         <w:rPr>
           <w:lang w:val="en"/>
         </w:rPr>
-        <w:lastRenderedPageBreak/>
         <w:t>Rise 360 · 4.1</w:t>
       </w:r>
     </w:p>
@@ -7069,7 +7039,6 @@
         <w:rPr>
           <w:lang w:val="en"/>
         </w:rPr>
-        <w:lastRenderedPageBreak/>
         <w:t>Rise 360 · 5.0</w:t>
       </w:r>
     </w:p>
@@ -7473,7 +7442,6 @@
         <w:rPr>
           <w:lang w:val="en"/>
         </w:rPr>
-        <w:lastRenderedPageBreak/>
         <w:t>Rise 360 · 5.1</w:t>
       </w:r>
     </w:p>
@@ -7814,14 +7782,6 @@
                 <w:szCs w:val="28"/>
               </w:rPr>
               <w:br/>
-            </w:r>
-            <w:r>
-              <w:rPr>
-                <w:rFonts w:ascii="Calibri" w:eastAsia="Times New Roman" w:hAnsi="Calibri" w:cs="Calibri"/>
-                <w:color w:val="3B3B3B"/>
-                <w:sz w:val="28"/>
-                <w:szCs w:val="28"/>
-              </w:rPr>
               <w:t>What data is this? (public / internal / personal / customer)</w:t>
             </w:r>
             <w:r>
@@ -8002,7 +7962,6 @@
         <w:rPr>
           <w:lang w:val="en"/>
         </w:rPr>
-        <w:lastRenderedPageBreak/>
         <w:t>Rise 360 · 5.2</w:t>
       </w:r>
     </w:p>
@@ -8809,7 +8768,6 @@
         <w:rPr>
           <w:lang w:val="en"/>
         </w:rPr>
-        <w:lastRenderedPageBreak/>
         <w:t>Rise 360 · 6.1</w:t>
       </w:r>
     </w:p>
@@ -9648,7 +9606,6 @@
           <w:color w:val="3B3B3B"/>
           <w:lang w:val="en"/>
         </w:rPr>
-        <w:lastRenderedPageBreak/>
         <w:t> </w:t>
       </w:r>
     </w:p>
@@ -10490,7 +10447,6 @@
         <w:rPr>
           <w:lang w:val="en"/>
         </w:rPr>
-        <w:lastRenderedPageBreak/>
         <w:t>Rise 360 · 6.5</w:t>
       </w:r>
     </w:p>
@@ -11316,7 +11272,6 @@
         <w:rPr>
           <w:lang w:val="en"/>
         </w:rPr>
-        <w:lastRenderedPageBreak/>
         <w:t>Rise 360 · 7.0</w:t>
       </w:r>
     </w:p>
@@ -12142,7 +12097,6 @@
         <w:rPr>
           <w:lang w:val="en"/>
         </w:rPr>
-        <w:lastRenderedPageBreak/>
         <w:t>Rise 360 · 7.2</w:t>
       </w:r>
     </w:p>
@@ -12571,7 +12525,6 @@
         <w:rPr>
           <w:lang w:val="en"/>
         </w:rPr>
-        <w:lastRenderedPageBreak/>
         <w:t>Storyline 360 — scenes, slides, layers</w:t>
       </w:r>
     </w:p>
@@ -13031,7 +12984,6 @@
         <w:rPr>
           <w:lang w:val="en"/>
         </w:rPr>
-        <w:lastRenderedPageBreak/>
         <w:t>Storyline 360 · 1.1</w:t>
       </w:r>
     </w:p>
@@ -13145,14 +13097,6 @@
                 <w:szCs w:val="28"/>
               </w:rPr>
               <w:br/>
-            </w:r>
-            <w:r>
-              <w:rPr>
-                <w:rFonts w:ascii="Calibri" w:eastAsia="Times New Roman" w:hAnsi="Calibri" w:cs="Calibri"/>
-                <w:color w:val="3B3B3B"/>
-                <w:sz w:val="28"/>
-                <w:szCs w:val="28"/>
-              </w:rPr>
               <w:t>Type (learner-facing): Open Sauce One 400/500/600 and League Gothic Regular. Install on Windows before trial week. Embed on publish.</w:t>
             </w:r>
             <w:r>
@@ -13501,7 +13445,6 @@
         <w:rPr>
           <w:lang w:val="en"/>
         </w:rPr>
-        <w:lastRenderedPageBreak/>
         <w:t>Storyline 360 · 1.2</w:t>
       </w:r>
     </w:p>
@@ -13953,7 +13896,6 @@
         <w:rPr>
           <w:lang w:val="en"/>
         </w:rPr>
-        <w:lastRenderedPageBreak/>
         <w:t>Storyline 360 · 2.1</w:t>
       </w:r>
     </w:p>
@@ -14312,14 +14254,6 @@
                 <w:szCs w:val="28"/>
               </w:rPr>
               <w:br/>
-            </w:r>
-            <w:r>
-              <w:rPr>
-                <w:rFonts w:ascii="Calibri" w:eastAsia="Times New Roman" w:hAnsi="Calibri" w:cs="Calibri"/>
-                <w:color w:val="3B3B3B"/>
-                <w:sz w:val="28"/>
-                <w:szCs w:val="28"/>
-              </w:rPr>
               <w:t>Don’t paste that. Name the data first.</w:t>
             </w:r>
             <w:r>
@@ -14461,7 +14395,6 @@
         <w:rPr>
           <w:lang w:val="en"/>
         </w:rPr>
-        <w:lastRenderedPageBreak/>
         <w:t>Storyline 360 · 2.2</w:t>
       </w:r>
     </w:p>
@@ -14772,14 +14705,6 @@
                 <w:szCs w:val="28"/>
               </w:rPr>
               <w:br/>
-            </w:r>
-            <w:r>
-              <w:rPr>
-                <w:rFonts w:ascii="Calibri" w:eastAsia="Times New Roman" w:hAnsi="Calibri" w:cs="Calibri"/>
-                <w:color w:val="3B3B3B"/>
-                <w:sz w:val="28"/>
-                <w:szCs w:val="28"/>
-              </w:rPr>
               <w:t>Don’t paste that. Emails and contract values are personal data and commercial data. Public tools may keep prompts. Classify first.</w:t>
             </w:r>
             <w:r>
@@ -14959,7 +14884,6 @@
         <w:rPr>
           <w:lang w:val="en"/>
         </w:rPr>
-        <w:lastRenderedPageBreak/>
         <w:t>Storyline 360 · 2.3</w:t>
       </w:r>
     </w:p>
@@ -15308,14 +15232,6 @@
                 <w:szCs w:val="28"/>
               </w:rPr>
               <w:br/>
-            </w:r>
-            <w:r>
-              <w:rPr>
-                <w:rFonts w:ascii="Calibri" w:eastAsia="Times New Roman" w:hAnsi="Calibri" w:cs="Calibri"/>
-                <w:color w:val="3B3B3B"/>
-                <w:sz w:val="28"/>
-                <w:szCs w:val="28"/>
-              </w:rPr>
               <w:t>Deleting the chat does not make the paste safe. Names, emails, and contract values are personal data under GDPR and confidential to the company. You have not failed. We classify it now, same as everyone else.</w:t>
             </w:r>
             <w:r>
@@ -15457,7 +15373,6 @@
         <w:rPr>
           <w:lang w:val="en"/>
         </w:rPr>
-        <w:lastRenderedPageBreak/>
         <w:t>Storyline 360 · 2.4</w:t>
       </w:r>
     </w:p>
@@ -15581,14 +15496,6 @@
                 <w:szCs w:val="28"/>
               </w:rPr>
               <w:br/>
-            </w:r>
-            <w:r>
-              <w:rPr>
-                <w:rFonts w:ascii="Calibri" w:eastAsia="Times New Roman" w:hAnsi="Calibri" w:cs="Calibri"/>
-                <w:color w:val="3B3B3B"/>
-                <w:sz w:val="28"/>
-                <w:szCs w:val="28"/>
-              </w:rPr>
               <w:t>Submit button.</w:t>
             </w:r>
             <w:r>
@@ -15967,7 +15874,6 @@
         <w:rPr>
           <w:lang w:val="en"/>
         </w:rPr>
-        <w:lastRenderedPageBreak/>
         <w:t>Storyline 360 · 2.4 L-right</w:t>
       </w:r>
     </w:p>
@@ -16409,7 +16315,6 @@
         <w:rPr>
           <w:lang w:val="en"/>
         </w:rPr>
-        <w:lastRenderedPageBreak/>
         <w:t>Storyline 360 · 2.4 L-wrong</w:t>
       </w:r>
     </w:p>
@@ -16710,14 +16615,6 @@
                 <w:szCs w:val="28"/>
               </w:rPr>
               <w:br/>
-            </w:r>
-            <w:r>
-              <w:rPr>
-                <w:rFonts w:ascii="Calibri" w:eastAsia="Times New Roman" w:hAnsi="Calibri" w:cs="Calibri"/>
-                <w:color w:val="3B3B3B"/>
-                <w:sz w:val="28"/>
-                <w:szCs w:val="28"/>
-              </w:rPr>
               <w:t>Emails and contract values are personal data and customer data. Classify it as that, then choose the tool.</w:t>
             </w:r>
             <w:r>
@@ -16859,7 +16756,6 @@
         <w:rPr>
           <w:lang w:val="en"/>
         </w:rPr>
-        <w:lastRenderedPageBreak/>
         <w:t>Storyline 360 · 2.5</w:t>
       </w:r>
     </w:p>
@@ -17389,7 +17285,6 @@
         <w:rPr>
           <w:lang w:val="en"/>
         </w:rPr>
-        <w:lastRenderedPageBreak/>
         <w:t>Storyline 360 · 2.6</w:t>
       </w:r>
     </w:p>
@@ -17690,14 +17585,6 @@
                 <w:szCs w:val="28"/>
               </w:rPr>
               <w:br/>
-            </w:r>
-            <w:r>
-              <w:rPr>
-                <w:rFonts w:ascii="Calibri" w:eastAsia="Times New Roman" w:hAnsi="Calibri" w:cs="Calibri"/>
-                <w:color w:val="3B3B3B"/>
-                <w:sz w:val="28"/>
-                <w:szCs w:val="28"/>
-              </w:rPr>
               <w:t>OK. I still want better English. What is the approved move?</w:t>
             </w:r>
             <w:r>
@@ -17896,7 +17783,6 @@
         <w:rPr>
           <w:lang w:val="en"/>
         </w:rPr>
-        <w:lastRenderedPageBreak/>
         <w:t>Storyline 360 · 2.7</w:t>
       </w:r>
     </w:p>
@@ -18338,7 +18224,6 @@
         <w:rPr>
           <w:lang w:val="en"/>
         </w:rPr>
-        <w:lastRenderedPageBreak/>
         <w:t>Storyline 360 · 2.8</w:t>
       </w:r>
     </w:p>
@@ -18780,7 +18665,6 @@
         <w:rPr>
           <w:lang w:val="en"/>
         </w:rPr>
-        <w:lastRenderedPageBreak/>
         <w:t>Storyline 360 · 3.1</w:t>
       </w:r>
     </w:p>
@@ -19241,7 +19125,6 @@
         <w:rPr>
           <w:lang w:val="en"/>
         </w:rPr>
-        <w:lastRenderedPageBreak/>
         <w:t>Storyline 360 · 3.2</w:t>
       </w:r>
     </w:p>
@@ -19693,7 +19576,6 @@
         <w:rPr>
           <w:lang w:val="en"/>
         </w:rPr>
-        <w:lastRenderedPageBreak/>
         <w:t>Storyline 360 · M1</w:t>
       </w:r>
     </w:p>
@@ -20137,7 +20019,6 @@
         <w:rPr>
           <w:lang w:val="en"/>
         </w:rPr>
-        <w:lastRenderedPageBreak/>
         <w:t>Storyline 360 · M2</w:t>
       </w:r>
     </w:p>
@@ -20429,14 +20310,6 @@
                 <w:szCs w:val="28"/>
               </w:rPr>
               <w:br/>
-            </w:r>
-            <w:r>
-              <w:rPr>
-                <w:rFonts w:ascii="Calibri" w:eastAsia="Times New Roman" w:hAnsi="Calibri" w:cs="Calibri"/>
-                <w:color w:val="3B3B3B"/>
-                <w:sz w:val="28"/>
-                <w:szCs w:val="28"/>
-              </w:rPr>
               <w:t>How this works</w:t>
             </w:r>
             <w:r>
@@ -20659,7 +20532,6 @@
         <w:rPr>
           <w:lang w:val="en"/>
         </w:rPr>
-        <w:lastRenderedPageBreak/>
         <w:t>Storyline 360 · M3</w:t>
       </w:r>
     </w:p>

</xml_diff>

<commit_message>
List only the assets each storyboard slide actually uses.
Co-authored-by: Cursor <cursoragent@cursor.com>
</commit_message>
<xml_diff>
--- a/Articulate assets/Storyboard Master/Portfolio sample_Before you paste classify.docx
+++ b/Articulate assets/Storyboard Master/Portfolio sample_Before you paste classify.docx
@@ -6,7 +6,7 @@
     <w:p>
       <w:pPr>
         <w:shd w:val="clear" w:color="auto" w:fill="E6E6E6"/>
-        <w:divId w:val="377240966"/>
+        <w:divId w:val="513541970"/>
         <w:rPr>
           <w:rFonts w:ascii="League Gothic" w:eastAsia="Times New Roman" w:hAnsi="League Gothic"/>
           <w:caps/>
@@ -48,7 +48,7 @@
       </w:tblGrid>
       <w:tr>
         <w:trPr>
-          <w:divId w:val="740102837"/>
+          <w:divId w:val="1015763364"/>
           <w:cantSplit/>
           <w:trHeight w:hRule="exact" w:val="160"/>
         </w:trPr>
@@ -119,7 +119,7 @@
       </w:tr>
       <w:tr>
         <w:trPr>
-          <w:divId w:val="740102837"/>
+          <w:divId w:val="1015763364"/>
           <w:cantSplit/>
         </w:trPr>
         <w:tc>
@@ -192,7 +192,7 @@
       </w:tr>
       <w:tr>
         <w:trPr>
-          <w:divId w:val="740102837"/>
+          <w:divId w:val="1015763364"/>
           <w:cantSplit/>
         </w:trPr>
         <w:tc>
@@ -265,7 +265,7 @@
       </w:tr>
       <w:tr>
         <w:trPr>
-          <w:divId w:val="740102837"/>
+          <w:divId w:val="1015763364"/>
           <w:cantSplit/>
         </w:trPr>
         <w:tc>
@@ -338,7 +338,7 @@
       </w:tr>
       <w:tr>
         <w:trPr>
-          <w:divId w:val="740102837"/>
+          <w:divId w:val="1015763364"/>
           <w:cantSplit/>
         </w:trPr>
         <w:tc>
@@ -411,7 +411,7 @@
       </w:tr>
       <w:tr>
         <w:trPr>
-          <w:divId w:val="740102837"/>
+          <w:divId w:val="1015763364"/>
           <w:cantSplit/>
         </w:trPr>
         <w:tc>
@@ -484,7 +484,7 @@
       </w:tr>
       <w:tr>
         <w:trPr>
-          <w:divId w:val="740102837"/>
+          <w:divId w:val="1015763364"/>
           <w:cantSplit/>
         </w:trPr>
         <w:tc>
@@ -557,7 +557,7 @@
       </w:tr>
       <w:tr>
         <w:trPr>
-          <w:divId w:val="740102837"/>
+          <w:divId w:val="1015763364"/>
           <w:cantSplit/>
         </w:trPr>
         <w:tc>
@@ -753,7 +753,7 @@
                 <w:p>
                   <w:pPr>
                     <w:pStyle w:val="type-note"/>
-                    <w:divId w:val="1798445594"/>
+                    <w:divId w:val="386758528"/>
                   </w:pPr>
                   <w:r>
                     <w:t>Document name · League Gothic · 22px · ink · UPPER CASE</w:t>
@@ -762,7 +762,7 @@
                 <w:p>
                   <w:pPr>
                     <w:pStyle w:val="doc-name"/>
-                    <w:divId w:val="1798445594"/>
+                    <w:divId w:val="386758528"/>
                   </w:pPr>
                   <w:r>
                     <w:t>DOCUMENT NAME</w:t>
@@ -771,7 +771,7 @@
                 <w:p>
                   <w:pPr>
                     <w:pStyle w:val="type-note"/>
-                    <w:divId w:val="1875383739"/>
+                    <w:divId w:val="595208083"/>
                   </w:pPr>
                   <w:r>
                     <w:t>Main Header (H1) · Open Sauce One 600 · 28px · ink · Upper and lower case</w:t>
@@ -780,7 +780,7 @@
                 <w:p>
                   <w:pPr>
                     <w:pStyle w:val="main-title"/>
-                    <w:divId w:val="1875383739"/>
+                    <w:divId w:val="595208083"/>
                   </w:pPr>
                   <w:r>
                     <w:t>Main Header (H1)</w:t>
@@ -789,7 +789,7 @@
                 <w:p>
                   <w:pPr>
                     <w:pStyle w:val="type-note"/>
-                    <w:divId w:val="1148202654"/>
+                    <w:divId w:val="1018970964"/>
                   </w:pPr>
                   <w:r>
                     <w:t>Object Title · League Gothic · 20px · ink · Upper and lower case</w:t>
@@ -798,7 +798,7 @@
                 <w:p>
                   <w:pPr>
                     <w:pStyle w:val="object-title"/>
-                    <w:divId w:val="1148202654"/>
+                    <w:divId w:val="1018970964"/>
                   </w:pPr>
                   <w:r>
                     <w:t>Object Title</w:t>
@@ -807,7 +807,7 @@
                 <w:p>
                   <w:pPr>
                     <w:pStyle w:val="type-note"/>
-                    <w:divId w:val="75978235"/>
+                    <w:divId w:val="201093894"/>
                   </w:pPr>
                   <w:r>
                     <w:t>Subhead · Open Sauce One 500 · 14pt · ink · Upper and lower case</w:t>
@@ -816,7 +816,7 @@
                 <w:p>
                   <w:pPr>
                     <w:pStyle w:val="medium"/>
-                    <w:divId w:val="75978235"/>
+                    <w:divId w:val="201093894"/>
                   </w:pPr>
                   <w:r>
                     <w:t>Subhead</w:t>
@@ -825,7 +825,7 @@
                 <w:p>
                   <w:pPr>
                     <w:pStyle w:val="type-note"/>
-                    <w:divId w:val="217016320"/>
+                    <w:divId w:val="1551570691"/>
                   </w:pPr>
                   <w:r>
                     <w:t>Body Text (body) · Open Sauce One 400 · 11pt · line-height 1.5 · ink · Upper and lower case</w:t>
@@ -834,7 +834,7 @@
                 <w:p>
                   <w:pPr>
                     <w:pStyle w:val="body-sample"/>
-                    <w:divId w:val="217016320"/>
+                    <w:divId w:val="1551570691"/>
                   </w:pPr>
                   <w:r>
                     <w:t>Body Text (body)</w:t>
@@ -843,7 +843,7 @@
                 <w:p>
                   <w:pPr>
                     <w:pStyle w:val="body-sample"/>
-                    <w:divId w:val="217016320"/>
+                    <w:divId w:val="1551570691"/>
                   </w:pPr>
                   <w:r>
                     <w:t>Lorem ipsum dolor sit amet, consectetur adipiscing elit. Sed do eiusmod tempor incididunt ut labore et dolore magna aliqua. Ut enim ad minim veniam, quis nostrud exercitation ullamco laboris nisi ut aliquip ex ea commodo consequat.</w:t>
@@ -852,7 +852,7 @@
                 <w:p>
                   <w:pPr>
                     <w:pStyle w:val="type-note"/>
-                    <w:divId w:val="1872063471"/>
+                    <w:divId w:val="1397776221"/>
                   </w:pPr>
                   <w:r>
                     <w:t>Button · Open Sauce One 500 · 11pt · ink · Upper and lower case</w:t>
@@ -861,7 +861,7 @@
                 <w:p>
                   <w:pPr>
                     <w:pStyle w:val="NormalWeb"/>
-                    <w:divId w:val="1872063471"/>
+                    <w:divId w:val="1397776221"/>
                     <w:rPr>
                       <w:color w:val="3B3B3B"/>
                     </w:rPr>
@@ -876,7 +876,7 @@
                 <w:p>
                   <w:pPr>
                     <w:pStyle w:val="type-note"/>
-                    <w:divId w:val="1572346967"/>
+                    <w:divId w:val="649595965"/>
                   </w:pPr>
                   <w:r>
                     <w:t>Caption · Open Sauce One 400 · 9.5pt · ink · Upper and lower case</w:t>
@@ -885,7 +885,7 @@
                 <w:p>
                   <w:pPr>
                     <w:pStyle w:val="caption-sample"/>
-                    <w:divId w:val="1572346967"/>
+                    <w:divId w:val="649595965"/>
                   </w:pPr>
                   <w:r>
                     <w:t>Caption</w:t>
@@ -1596,7 +1596,7 @@
       <w:pPr>
         <w:pStyle w:val="card-title"/>
         <w:keepLines/>
-        <w:divId w:val="2109545784"/>
+        <w:divId w:val="804205202"/>
         <w:rPr>
           <w:lang w:val="en"/>
         </w:rPr>
@@ -1626,7 +1626,7 @@
       </w:tblGrid>
       <w:tr>
         <w:trPr>
-          <w:divId w:val="2109545784"/>
+          <w:divId w:val="804205202"/>
           <w:cantSplit/>
         </w:trPr>
         <w:tc>
@@ -1708,7 +1708,7 @@
                 <w:sz w:val="28"/>
                 <w:szCs w:val="28"/>
               </w:rPr>
-              <w:t>Slide / block background: solid paper #FFFFFF. No background photograph. No 360° image.</w:t>
+              <w:t>Rise player chrome. Ink on paper. Type: Open Sauce One.</w:t>
             </w:r>
             <w:r>
               <w:rPr>
@@ -1718,24 +1718,14 @@
                 <w:szCs w:val="28"/>
               </w:rPr>
               <w:br/>
-              <w:t>Type (learner-facing): Open Sauce One 400/500/600 and League Gothic Regular. Install on Windows before trial week. Embed on publish.</w:t>
-            </w:r>
-            <w:r>
-              <w:rPr>
-                <w:rFonts w:ascii="Calibri" w:eastAsia="Times New Roman" w:hAnsi="Calibri" w:cs="Calibri"/>
-                <w:color w:val="3B3B3B"/>
-                <w:sz w:val="28"/>
-                <w:szCs w:val="28"/>
-              </w:rPr>
-              <w:br/>
-              <w:t>No audio. No logo.</w:t>
+              <w:t>Slide / block background: solid paper #FFFFFF.</w:t>
             </w:r>
           </w:p>
         </w:tc>
       </w:tr>
       <w:tr>
         <w:trPr>
-          <w:divId w:val="2109545784"/>
+          <w:divId w:val="804205202"/>
           <w:cantSplit/>
         </w:trPr>
         <w:tc>
@@ -1824,7 +1814,7 @@
       </w:tr>
       <w:tr>
         <w:trPr>
-          <w:divId w:val="2109545784"/>
+          <w:divId w:val="804205202"/>
           <w:cantSplit/>
         </w:trPr>
         <w:tc>
@@ -1953,7 +1943,7 @@
       </w:tr>
       <w:tr>
         <w:trPr>
-          <w:divId w:val="2109545784"/>
+          <w:divId w:val="804205202"/>
           <w:cantSplit/>
         </w:trPr>
         <w:tc>
@@ -2059,7 +2049,7 @@
       <w:pPr>
         <w:pStyle w:val="card-title"/>
         <w:keepLines/>
-        <w:divId w:val="1404185336"/>
+        <w:divId w:val="349259580"/>
         <w:rPr>
           <w:lang w:val="en"/>
         </w:rPr>
@@ -2068,6 +2058,7 @@
         <w:rPr>
           <w:lang w:val="en"/>
         </w:rPr>
+        <w:lastRenderedPageBreak/>
         <w:t>Rise 360 · 1.0</w:t>
       </w:r>
     </w:p>
@@ -2089,7 +2080,7 @@
       </w:tblGrid>
       <w:tr>
         <w:trPr>
-          <w:divId w:val="1404185336"/>
+          <w:divId w:val="349259580"/>
           <w:cantSplit/>
         </w:trPr>
         <w:tc>
@@ -2159,26 +2150,19 @@
               <w:keepLines/>
               <w:rPr>
                 <w:rFonts w:ascii="Calibri" w:eastAsia="Times New Roman" w:hAnsi="Calibri" w:cs="Calibri"/>
-                <w:color w:val="3B3B3B"/>
-                <w:sz w:val="28"/>
-                <w:szCs w:val="28"/>
-              </w:rPr>
-            </w:pPr>
-            <w:r>
-              <w:rPr>
-                <w:rFonts w:ascii="Calibri" w:eastAsia="Times New Roman" w:hAnsi="Calibri" w:cs="Calibri"/>
-                <w:color w:val="3B3B3B"/>
-                <w:sz w:val="28"/>
-                <w:szCs w:val="28"/>
-              </w:rPr>
-              <w:t>None. Sidebar label only.</w:t>
-            </w:r>
+                <w:b/>
+                <w:bCs/>
+                <w:color w:val="3B3B3B"/>
+                <w:sz w:val="32"/>
+                <w:szCs w:val="32"/>
+              </w:rPr>
+            </w:pPr>
           </w:p>
         </w:tc>
       </w:tr>
       <w:tr>
         <w:trPr>
-          <w:divId w:val="1404185336"/>
+          <w:divId w:val="349259580"/>
           <w:cantSplit/>
         </w:trPr>
         <w:tc>
@@ -2267,7 +2251,7 @@
       </w:tr>
       <w:tr>
         <w:trPr>
-          <w:divId w:val="1404185336"/>
+          <w:divId w:val="349259580"/>
           <w:cantSplit/>
         </w:trPr>
         <w:tc>
@@ -2356,7 +2340,7 @@
       </w:tr>
       <w:tr>
         <w:trPr>
-          <w:divId w:val="1404185336"/>
+          <w:divId w:val="349259580"/>
           <w:cantSplit/>
         </w:trPr>
         <w:tc>
@@ -2462,7 +2446,7 @@
       <w:pPr>
         <w:pStyle w:val="card-title"/>
         <w:keepLines/>
-        <w:divId w:val="1348018676"/>
+        <w:divId w:val="155540549"/>
         <w:rPr>
           <w:lang w:val="en"/>
         </w:rPr>
@@ -2492,7 +2476,7 @@
       </w:tblGrid>
       <w:tr>
         <w:trPr>
-          <w:divId w:val="1348018676"/>
+          <w:divId w:val="155540549"/>
           <w:cantSplit/>
         </w:trPr>
         <w:tc>
@@ -2574,34 +2558,14 @@
                 <w:sz w:val="28"/>
                 <w:szCs w:val="28"/>
               </w:rPr>
-              <w:t>Slide / block background: solid paper #FFFFFF. No background photograph. No 360° image.</w:t>
-            </w:r>
-            <w:r>
-              <w:rPr>
-                <w:rFonts w:ascii="Calibri" w:eastAsia="Times New Roman" w:hAnsi="Calibri" w:cs="Calibri"/>
-                <w:color w:val="3B3B3B"/>
-                <w:sz w:val="28"/>
-                <w:szCs w:val="28"/>
-              </w:rPr>
-              <w:br/>
-              <w:t>Optional line icon only (classify / stop). If used: SVG or PNG, ink #3B3B3B, alt text required.</w:t>
-            </w:r>
-            <w:r>
-              <w:rPr>
-                <w:rFonts w:ascii="Calibri" w:eastAsia="Times New Roman" w:hAnsi="Calibri" w:cs="Calibri"/>
-                <w:color w:val="3B3B3B"/>
-                <w:sz w:val="28"/>
-                <w:szCs w:val="28"/>
-              </w:rPr>
-              <w:br/>
-              <w:t>No photo.</w:t>
+              <w:t>Slide / block background: solid paper #FFFFFF.</w:t>
             </w:r>
           </w:p>
         </w:tc>
       </w:tr>
       <w:tr>
         <w:trPr>
-          <w:divId w:val="1348018676"/>
+          <w:divId w:val="155540549"/>
           <w:cantSplit/>
         </w:trPr>
         <w:tc>
@@ -2690,7 +2654,7 @@
       </w:tr>
       <w:tr>
         <w:trPr>
-          <w:divId w:val="1348018676"/>
+          <w:divId w:val="155540549"/>
           <w:cantSplit/>
         </w:trPr>
         <w:tc>
@@ -2798,7 +2762,7 @@
       </w:tr>
       <w:tr>
         <w:trPr>
-          <w:divId w:val="1348018676"/>
+          <w:divId w:val="155540549"/>
           <w:cantSplit/>
         </w:trPr>
         <w:tc>
@@ -2878,7 +2842,7 @@
                 <w:sz w:val="28"/>
                 <w:szCs w:val="28"/>
               </w:rPr>
-              <w:t>No click on the text. Heading is the cover title. Body is one paragraph under it. Do wash not required.</w:t>
+              <w:t>No click on the text. Heading is the cover title. Body is one paragraph under it.</w:t>
             </w:r>
           </w:p>
         </w:tc>
@@ -2904,7 +2868,7 @@
       <w:pPr>
         <w:pStyle w:val="card-title"/>
         <w:keepLines/>
-        <w:divId w:val="381057026"/>
+        <w:divId w:val="162862388"/>
         <w:rPr>
           <w:lang w:val="en"/>
         </w:rPr>
@@ -2913,6 +2877,7 @@
         <w:rPr>
           <w:lang w:val="en"/>
         </w:rPr>
+        <w:lastRenderedPageBreak/>
         <w:t>Rise 360 · 1.2</w:t>
       </w:r>
     </w:p>
@@ -2934,7 +2899,7 @@
       </w:tblGrid>
       <w:tr>
         <w:trPr>
-          <w:divId w:val="381057026"/>
+          <w:divId w:val="162862388"/>
           <w:cantSplit/>
         </w:trPr>
         <w:tc>
@@ -3016,14 +2981,14 @@
                 <w:sz w:val="28"/>
                 <w:szCs w:val="28"/>
               </w:rPr>
-              <w:t>Button: Rise default Continue control. Ink on paper. No custom image.</w:t>
+              <w:t>Rise default Continue button. Ink on paper.</w:t>
             </w:r>
           </w:p>
         </w:tc>
       </w:tr>
       <w:tr>
         <w:trPr>
-          <w:divId w:val="381057026"/>
+          <w:divId w:val="162862388"/>
           <w:cantSplit/>
         </w:trPr>
         <w:tc>
@@ -3112,7 +3077,7 @@
       </w:tr>
       <w:tr>
         <w:trPr>
-          <w:divId w:val="381057026"/>
+          <w:divId w:val="162862388"/>
           <w:cantSplit/>
         </w:trPr>
         <w:tc>
@@ -3201,7 +3166,7 @@
       </w:tr>
       <w:tr>
         <w:trPr>
-          <w:divId w:val="381057026"/>
+          <w:divId w:val="162862388"/>
           <w:cantSplit/>
         </w:trPr>
         <w:tc>
@@ -3307,7 +3272,7 @@
       <w:pPr>
         <w:pStyle w:val="card-title"/>
         <w:keepLines/>
-        <w:divId w:val="1950428355"/>
+        <w:divId w:val="872691761"/>
         <w:rPr>
           <w:lang w:val="en"/>
         </w:rPr>
@@ -3337,7 +3302,7 @@
       </w:tblGrid>
       <w:tr>
         <w:trPr>
-          <w:divId w:val="1950428355"/>
+          <w:divId w:val="872691761"/>
           <w:cantSplit/>
         </w:trPr>
         <w:tc>
@@ -3407,26 +3372,19 @@
               <w:keepLines/>
               <w:rPr>
                 <w:rFonts w:ascii="Calibri" w:eastAsia="Times New Roman" w:hAnsi="Calibri" w:cs="Calibri"/>
-                <w:color w:val="3B3B3B"/>
-                <w:sz w:val="28"/>
-                <w:szCs w:val="28"/>
-              </w:rPr>
-            </w:pPr>
-            <w:r>
-              <w:rPr>
-                <w:rFonts w:ascii="Calibri" w:eastAsia="Times New Roman" w:hAnsi="Calibri" w:cs="Calibri"/>
-                <w:color w:val="3B3B3B"/>
-                <w:sz w:val="28"/>
-                <w:szCs w:val="28"/>
-              </w:rPr>
-              <w:t>None. Sidebar label only.</w:t>
-            </w:r>
+                <w:b/>
+                <w:bCs/>
+                <w:color w:val="3B3B3B"/>
+                <w:sz w:val="32"/>
+                <w:szCs w:val="32"/>
+              </w:rPr>
+            </w:pPr>
           </w:p>
         </w:tc>
       </w:tr>
       <w:tr>
         <w:trPr>
-          <w:divId w:val="1950428355"/>
+          <w:divId w:val="872691761"/>
           <w:cantSplit/>
         </w:trPr>
         <w:tc>
@@ -3515,7 +3473,7 @@
       </w:tr>
       <w:tr>
         <w:trPr>
-          <w:divId w:val="1950428355"/>
+          <w:divId w:val="872691761"/>
           <w:cantSplit/>
         </w:trPr>
         <w:tc>
@@ -3604,7 +3562,7 @@
       </w:tr>
       <w:tr>
         <w:trPr>
-          <w:divId w:val="1950428355"/>
+          <w:divId w:val="872691761"/>
           <w:cantSplit/>
         </w:trPr>
         <w:tc>
@@ -3710,7 +3668,7 @@
       <w:pPr>
         <w:pStyle w:val="card-title"/>
         <w:keepLines/>
-        <w:divId w:val="206994789"/>
+        <w:divId w:val="528879169"/>
         <w:rPr>
           <w:lang w:val="en"/>
         </w:rPr>
@@ -3719,6 +3677,7 @@
         <w:rPr>
           <w:lang w:val="en"/>
         </w:rPr>
+        <w:lastRenderedPageBreak/>
         <w:t>Rise 360 · 2.1</w:t>
       </w:r>
     </w:p>
@@ -3740,7 +3699,7 @@
       </w:tblGrid>
       <w:tr>
         <w:trPr>
-          <w:divId w:val="206994789"/>
+          <w:divId w:val="528879169"/>
           <w:cantSplit/>
         </w:trPr>
         <w:tc>
@@ -3822,24 +3781,14 @@
                 <w:sz w:val="28"/>
                 <w:szCs w:val="28"/>
               </w:rPr>
-              <w:t>Slide / block background: solid paper #FFFFFF. No background photograph. No 360° image.</w:t>
-            </w:r>
-            <w:r>
-              <w:rPr>
-                <w:rFonts w:ascii="Calibri" w:eastAsia="Times New Roman" w:hAnsi="Calibri" w:cs="Calibri"/>
-                <w:color w:val="3B3B3B"/>
-                <w:sz w:val="28"/>
-                <w:szCs w:val="28"/>
-              </w:rPr>
-              <w:br/>
-              <w:t>No character art in Rise. No photo of a “colleague.”</w:t>
+              <w:t>Slide / block background: solid paper #FFFFFF.</w:t>
             </w:r>
           </w:p>
         </w:tc>
       </w:tr>
       <w:tr>
         <w:trPr>
-          <w:divId w:val="206994789"/>
+          <w:divId w:val="528879169"/>
           <w:cantSplit/>
         </w:trPr>
         <w:tc>
@@ -3928,7 +3877,7 @@
       </w:tr>
       <w:tr>
         <w:trPr>
-          <w:divId w:val="206994789"/>
+          <w:divId w:val="528879169"/>
           <w:cantSplit/>
         </w:trPr>
         <w:tc>
@@ -4036,7 +3985,7 @@
       </w:tr>
       <w:tr>
         <w:trPr>
-          <w:divId w:val="206994789"/>
+          <w:divId w:val="528879169"/>
           <w:cantSplit/>
         </w:trPr>
         <w:tc>
@@ -4142,7 +4091,7 @@
       <w:pPr>
         <w:pStyle w:val="card-title"/>
         <w:keepLines/>
-        <w:divId w:val="218518096"/>
+        <w:divId w:val="679232791"/>
         <w:rPr>
           <w:lang w:val="en"/>
         </w:rPr>
@@ -4172,7 +4121,7 @@
       </w:tblGrid>
       <w:tr>
         <w:trPr>
-          <w:divId w:val="218518096"/>
+          <w:divId w:val="679232791"/>
           <w:cantSplit/>
         </w:trPr>
         <w:tc>
@@ -4254,14 +4203,14 @@
                 <w:sz w:val="28"/>
                 <w:szCs w:val="28"/>
               </w:rPr>
-              <w:t>Two Rise scenario buttons. No extra icons required.</w:t>
+              <w:t>Two Rise scenario buttons.</w:t>
             </w:r>
           </w:p>
         </w:tc>
       </w:tr>
       <w:tr>
         <w:trPr>
-          <w:divId w:val="218518096"/>
+          <w:divId w:val="679232791"/>
           <w:cantSplit/>
         </w:trPr>
         <w:tc>
@@ -4350,7 +4299,7 @@
       </w:tr>
       <w:tr>
         <w:trPr>
-          <w:divId w:val="218518096"/>
+          <w:divId w:val="679232791"/>
           <w:cantSplit/>
         </w:trPr>
         <w:tc>
@@ -4458,7 +4407,7 @@
       </w:tr>
       <w:tr>
         <w:trPr>
-          <w:divId w:val="218518096"/>
+          <w:divId w:val="679232791"/>
           <w:cantSplit/>
         </w:trPr>
         <w:tc>
@@ -4564,7 +4513,7 @@
       <w:pPr>
         <w:pStyle w:val="card-title"/>
         <w:keepLines/>
-        <w:divId w:val="1740252875"/>
+        <w:divId w:val="456603403"/>
         <w:rPr>
           <w:lang w:val="en"/>
         </w:rPr>
@@ -4573,6 +4522,7 @@
         <w:rPr>
           <w:lang w:val="en"/>
         </w:rPr>
+        <w:lastRenderedPageBreak/>
         <w:t>Rise 360 · 3.0</w:t>
       </w:r>
     </w:p>
@@ -4594,7 +4544,7 @@
       </w:tblGrid>
       <w:tr>
         <w:trPr>
-          <w:divId w:val="1740252875"/>
+          <w:divId w:val="456603403"/>
           <w:cantSplit/>
         </w:trPr>
         <w:tc>
@@ -4664,26 +4614,19 @@
               <w:keepLines/>
               <w:rPr>
                 <w:rFonts w:ascii="Calibri" w:eastAsia="Times New Roman" w:hAnsi="Calibri" w:cs="Calibri"/>
-                <w:color w:val="3B3B3B"/>
-                <w:sz w:val="28"/>
-                <w:szCs w:val="28"/>
-              </w:rPr>
-            </w:pPr>
-            <w:r>
-              <w:rPr>
-                <w:rFonts w:ascii="Calibri" w:eastAsia="Times New Roman" w:hAnsi="Calibri" w:cs="Calibri"/>
-                <w:color w:val="3B3B3B"/>
-                <w:sz w:val="28"/>
-                <w:szCs w:val="28"/>
-              </w:rPr>
-              <w:t>None. Sidebar label only.</w:t>
-            </w:r>
+                <w:b/>
+                <w:bCs/>
+                <w:color w:val="3B3B3B"/>
+                <w:sz w:val="32"/>
+                <w:szCs w:val="32"/>
+              </w:rPr>
+            </w:pPr>
           </w:p>
         </w:tc>
       </w:tr>
       <w:tr>
         <w:trPr>
-          <w:divId w:val="1740252875"/>
+          <w:divId w:val="456603403"/>
           <w:cantSplit/>
         </w:trPr>
         <w:tc>
@@ -4772,7 +4715,7 @@
       </w:tr>
       <w:tr>
         <w:trPr>
-          <w:divId w:val="1740252875"/>
+          <w:divId w:val="456603403"/>
           <w:cantSplit/>
         </w:trPr>
         <w:tc>
@@ -4861,7 +4804,7 @@
       </w:tr>
       <w:tr>
         <w:trPr>
-          <w:divId w:val="1740252875"/>
+          <w:divId w:val="456603403"/>
           <w:cantSplit/>
         </w:trPr>
         <w:tc>
@@ -4967,7 +4910,7 @@
       <w:pPr>
         <w:pStyle w:val="card-title"/>
         <w:keepLines/>
-        <w:divId w:val="470051743"/>
+        <w:divId w:val="623195330"/>
         <w:rPr>
           <w:lang w:val="en"/>
         </w:rPr>
@@ -4997,7 +4940,7 @@
       </w:tblGrid>
       <w:tr>
         <w:trPr>
-          <w:divId w:val="470051743"/>
+          <w:divId w:val="623195330"/>
           <w:cantSplit/>
         </w:trPr>
         <w:tc>
@@ -5079,7 +5022,7 @@
                 <w:sz w:val="28"/>
                 <w:szCs w:val="28"/>
               </w:rPr>
-              <w:t>Block fill: don’t wash #E8DED5 behind “Stop.” if Rise coloured blocks are used.</w:t>
+              <w:t>Block fill: don’t wash #E8DED5.</w:t>
             </w:r>
             <w:r>
               <w:rPr>
@@ -5089,14 +5032,14 @@
                 <w:szCs w:val="28"/>
               </w:rPr>
               <w:br/>
-              <w:t>Slide / block background: solid paper #FFFFFF. No background photograph. No 360° image.</w:t>
+              <w:t>Slide / block background: solid paper #FFFFFF.</w:t>
             </w:r>
           </w:p>
         </w:tc>
       </w:tr>
       <w:tr>
         <w:trPr>
-          <w:divId w:val="470051743"/>
+          <w:divId w:val="623195330"/>
           <w:cantSplit/>
         </w:trPr>
         <w:tc>
@@ -5185,7 +5128,7 @@
       </w:tr>
       <w:tr>
         <w:trPr>
-          <w:divId w:val="470051743"/>
+          <w:divId w:val="623195330"/>
           <w:cantSplit/>
         </w:trPr>
         <w:tc>
@@ -5293,7 +5236,7 @@
       </w:tr>
       <w:tr>
         <w:trPr>
-          <w:divId w:val="470051743"/>
+          <w:divId w:val="623195330"/>
           <w:cantSplit/>
         </w:trPr>
         <w:tc>
@@ -5399,7 +5342,7 @@
       <w:pPr>
         <w:pStyle w:val="card-title"/>
         <w:keepLines/>
-        <w:divId w:val="70472405"/>
+        <w:divId w:val="1165903101"/>
         <w:rPr>
           <w:lang w:val="en"/>
         </w:rPr>
@@ -5408,6 +5351,7 @@
         <w:rPr>
           <w:lang w:val="en"/>
         </w:rPr>
+        <w:lastRenderedPageBreak/>
         <w:t>Rise 360 · 3.2</w:t>
       </w:r>
     </w:p>
@@ -5429,7 +5373,7 @@
       </w:tblGrid>
       <w:tr>
         <w:trPr>
-          <w:divId w:val="70472405"/>
+          <w:divId w:val="1165903101"/>
           <w:cantSplit/>
         </w:trPr>
         <w:tc>
@@ -5511,14 +5455,14 @@
                 <w:sz w:val="28"/>
                 <w:szCs w:val="28"/>
               </w:rPr>
-              <w:t>Button: Rise Continue. No custom image.</w:t>
+              <w:t>Rise Continue button.</w:t>
             </w:r>
           </w:p>
         </w:tc>
       </w:tr>
       <w:tr>
         <w:trPr>
-          <w:divId w:val="70472405"/>
+          <w:divId w:val="1165903101"/>
           <w:cantSplit/>
         </w:trPr>
         <w:tc>
@@ -5607,7 +5551,7 @@
       </w:tr>
       <w:tr>
         <w:trPr>
-          <w:divId w:val="70472405"/>
+          <w:divId w:val="1165903101"/>
           <w:cantSplit/>
         </w:trPr>
         <w:tc>
@@ -5696,7 +5640,7 @@
       </w:tr>
       <w:tr>
         <w:trPr>
-          <w:divId w:val="70472405"/>
+          <w:divId w:val="1165903101"/>
           <w:cantSplit/>
         </w:trPr>
         <w:tc>
@@ -5802,7 +5746,7 @@
       <w:pPr>
         <w:pStyle w:val="card-title"/>
         <w:keepLines/>
-        <w:divId w:val="1324353628"/>
+        <w:divId w:val="1303075004"/>
         <w:rPr>
           <w:lang w:val="en"/>
         </w:rPr>
@@ -5832,7 +5776,7 @@
       </w:tblGrid>
       <w:tr>
         <w:trPr>
-          <w:divId w:val="1324353628"/>
+          <w:divId w:val="1303075004"/>
           <w:cantSplit/>
         </w:trPr>
         <w:tc>
@@ -5902,26 +5846,19 @@
               <w:keepLines/>
               <w:rPr>
                 <w:rFonts w:ascii="Calibri" w:eastAsia="Times New Roman" w:hAnsi="Calibri" w:cs="Calibri"/>
-                <w:color w:val="3B3B3B"/>
-                <w:sz w:val="28"/>
-                <w:szCs w:val="28"/>
-              </w:rPr>
-            </w:pPr>
-            <w:r>
-              <w:rPr>
-                <w:rFonts w:ascii="Calibri" w:eastAsia="Times New Roman" w:hAnsi="Calibri" w:cs="Calibri"/>
-                <w:color w:val="3B3B3B"/>
-                <w:sz w:val="28"/>
-                <w:szCs w:val="28"/>
-              </w:rPr>
-              <w:t>None. Sidebar label only.</w:t>
-            </w:r>
+                <w:b/>
+                <w:bCs/>
+                <w:color w:val="3B3B3B"/>
+                <w:sz w:val="32"/>
+                <w:szCs w:val="32"/>
+              </w:rPr>
+            </w:pPr>
           </w:p>
         </w:tc>
       </w:tr>
       <w:tr>
         <w:trPr>
-          <w:divId w:val="1324353628"/>
+          <w:divId w:val="1303075004"/>
           <w:cantSplit/>
         </w:trPr>
         <w:tc>
@@ -6010,7 +5947,7 @@
       </w:tr>
       <w:tr>
         <w:trPr>
-          <w:divId w:val="1324353628"/>
+          <w:divId w:val="1303075004"/>
           <w:cantSplit/>
         </w:trPr>
         <w:tc>
@@ -6099,7 +6036,7 @@
       </w:tr>
       <w:tr>
         <w:trPr>
-          <w:divId w:val="1324353628"/>
+          <w:divId w:val="1303075004"/>
           <w:cantSplit/>
         </w:trPr>
         <w:tc>
@@ -6205,7 +6142,7 @@
       <w:pPr>
         <w:pStyle w:val="card-title"/>
         <w:keepLines/>
-        <w:divId w:val="279069178"/>
+        <w:divId w:val="401951362"/>
         <w:rPr>
           <w:lang w:val="en"/>
         </w:rPr>
@@ -6214,6 +6151,7 @@
         <w:rPr>
           <w:lang w:val="en"/>
         </w:rPr>
+        <w:lastRenderedPageBreak/>
         <w:t>Rise 360 · 4.1</w:t>
       </w:r>
     </w:p>
@@ -6235,7 +6173,7 @@
       </w:tblGrid>
       <w:tr>
         <w:trPr>
-          <w:divId w:val="279069178"/>
+          <w:divId w:val="401951362"/>
           <w:cantSplit/>
         </w:trPr>
         <w:tc>
@@ -6317,14 +6255,14 @@
                 <w:sz w:val="28"/>
                 <w:szCs w:val="28"/>
               </w:rPr>
-              <w:t>Block fill: don’t wash #E8DED5 behind the heading if a coloured block is used.</w:t>
+              <w:t>Block fill: don’t wash #E8DED5.</w:t>
             </w:r>
           </w:p>
         </w:tc>
       </w:tr>
       <w:tr>
         <w:trPr>
-          <w:divId w:val="279069178"/>
+          <w:divId w:val="401951362"/>
           <w:cantSplit/>
         </w:trPr>
         <w:tc>
@@ -6413,7 +6351,7 @@
       </w:tr>
       <w:tr>
         <w:trPr>
-          <w:divId w:val="279069178"/>
+          <w:divId w:val="401951362"/>
           <w:cantSplit/>
         </w:trPr>
         <w:tc>
@@ -6521,7 +6459,7 @@
       </w:tr>
       <w:tr>
         <w:trPr>
-          <w:divId w:val="279069178"/>
+          <w:divId w:val="401951362"/>
           <w:cantSplit/>
         </w:trPr>
         <w:tc>
@@ -6627,7 +6565,7 @@
       <w:pPr>
         <w:pStyle w:val="card-title"/>
         <w:keepLines/>
-        <w:divId w:val="471213386"/>
+        <w:divId w:val="761798191"/>
         <w:rPr>
           <w:lang w:val="en"/>
         </w:rPr>
@@ -6657,7 +6595,7 @@
       </w:tblGrid>
       <w:tr>
         <w:trPr>
-          <w:divId w:val="471213386"/>
+          <w:divId w:val="761798191"/>
           <w:cantSplit/>
         </w:trPr>
         <w:tc>
@@ -6739,14 +6677,14 @@
                 <w:sz w:val="28"/>
                 <w:szCs w:val="28"/>
               </w:rPr>
-              <w:t>Button: Rise Continue. No custom image.</w:t>
+              <w:t>Rise Continue button.</w:t>
             </w:r>
           </w:p>
         </w:tc>
       </w:tr>
       <w:tr>
         <w:trPr>
-          <w:divId w:val="471213386"/>
+          <w:divId w:val="761798191"/>
           <w:cantSplit/>
         </w:trPr>
         <w:tc>
@@ -6835,7 +6773,7 @@
       </w:tr>
       <w:tr>
         <w:trPr>
-          <w:divId w:val="471213386"/>
+          <w:divId w:val="761798191"/>
           <w:cantSplit/>
         </w:trPr>
         <w:tc>
@@ -6924,7 +6862,7 @@
       </w:tr>
       <w:tr>
         <w:trPr>
-          <w:divId w:val="471213386"/>
+          <w:divId w:val="761798191"/>
           <w:cantSplit/>
         </w:trPr>
         <w:tc>
@@ -7030,7 +6968,7 @@
       <w:pPr>
         <w:pStyle w:val="card-title"/>
         <w:keepLines/>
-        <w:divId w:val="1550801466"/>
+        <w:divId w:val="495658807"/>
         <w:rPr>
           <w:lang w:val="en"/>
         </w:rPr>
@@ -7039,6 +6977,7 @@
         <w:rPr>
           <w:lang w:val="en"/>
         </w:rPr>
+        <w:lastRenderedPageBreak/>
         <w:t>Rise 360 · 5.0</w:t>
       </w:r>
     </w:p>
@@ -7060,7 +6999,7 @@
       </w:tblGrid>
       <w:tr>
         <w:trPr>
-          <w:divId w:val="1550801466"/>
+          <w:divId w:val="495658807"/>
           <w:cantSplit/>
         </w:trPr>
         <w:tc>
@@ -7130,26 +7069,19 @@
               <w:keepLines/>
               <w:rPr>
                 <w:rFonts w:ascii="Calibri" w:eastAsia="Times New Roman" w:hAnsi="Calibri" w:cs="Calibri"/>
-                <w:color w:val="3B3B3B"/>
-                <w:sz w:val="28"/>
-                <w:szCs w:val="28"/>
-              </w:rPr>
-            </w:pPr>
-            <w:r>
-              <w:rPr>
-                <w:rFonts w:ascii="Calibri" w:eastAsia="Times New Roman" w:hAnsi="Calibri" w:cs="Calibri"/>
-                <w:color w:val="3B3B3B"/>
-                <w:sz w:val="28"/>
-                <w:szCs w:val="28"/>
-              </w:rPr>
-              <w:t>None. Sidebar label only.</w:t>
-            </w:r>
+                <w:b/>
+                <w:bCs/>
+                <w:color w:val="3B3B3B"/>
+                <w:sz w:val="32"/>
+                <w:szCs w:val="32"/>
+              </w:rPr>
+            </w:pPr>
           </w:p>
         </w:tc>
       </w:tr>
       <w:tr>
         <w:trPr>
-          <w:divId w:val="1550801466"/>
+          <w:divId w:val="495658807"/>
           <w:cantSplit/>
         </w:trPr>
         <w:tc>
@@ -7238,7 +7170,7 @@
       </w:tr>
       <w:tr>
         <w:trPr>
-          <w:divId w:val="1550801466"/>
+          <w:divId w:val="495658807"/>
           <w:cantSplit/>
         </w:trPr>
         <w:tc>
@@ -7327,7 +7259,7 @@
       </w:tr>
       <w:tr>
         <w:trPr>
-          <w:divId w:val="1550801466"/>
+          <w:divId w:val="495658807"/>
           <w:cantSplit/>
         </w:trPr>
         <w:tc>
@@ -7433,7 +7365,7 @@
       <w:pPr>
         <w:pStyle w:val="card-title"/>
         <w:keepLines/>
-        <w:divId w:val="1593589086"/>
+        <w:divId w:val="1457603737"/>
         <w:rPr>
           <w:lang w:val="en"/>
         </w:rPr>
@@ -7442,6 +7374,7 @@
         <w:rPr>
           <w:lang w:val="en"/>
         </w:rPr>
+        <w:lastRenderedPageBreak/>
         <w:t>Rise 360 · 5.1</w:t>
       </w:r>
     </w:p>
@@ -7463,7 +7396,7 @@
       </w:tblGrid>
       <w:tr>
         <w:trPr>
-          <w:divId w:val="1593589086"/>
+          <w:divId w:val="1457603737"/>
           <w:cantSplit/>
         </w:trPr>
         <w:tc>
@@ -7567,22 +7500,12 @@
               <w:br/>
               <w:t>Captions in Open Sauce One 400.</w:t>
             </w:r>
-            <w:r>
-              <w:rPr>
-                <w:rFonts w:ascii="Calibri" w:eastAsia="Times New Roman" w:hAnsi="Calibri" w:cs="Calibri"/>
-                <w:color w:val="3B3B3B"/>
-                <w:sz w:val="28"/>
-                <w:szCs w:val="28"/>
-              </w:rPr>
-              <w:br/>
-              <w:t>No photographs. No 360° images.</w:t>
-            </w:r>
           </w:p>
         </w:tc>
       </w:tr>
       <w:tr>
         <w:trPr>
-          <w:divId w:val="1593589086"/>
+          <w:divId w:val="1457603737"/>
           <w:cantSplit/>
         </w:trPr>
         <w:tc>
@@ -7671,7 +7594,7 @@
       </w:tr>
       <w:tr>
         <w:trPr>
-          <w:divId w:val="1593589086"/>
+          <w:divId w:val="1457603737"/>
           <w:cantSplit/>
         </w:trPr>
         <w:tc>
@@ -7847,7 +7770,7 @@
       </w:tr>
       <w:tr>
         <w:trPr>
-          <w:divId w:val="1593589086"/>
+          <w:divId w:val="1457603737"/>
           <w:cantSplit/>
         </w:trPr>
         <w:tc>
@@ -7953,7 +7876,7 @@
       <w:pPr>
         <w:pStyle w:val="card-title"/>
         <w:keepLines/>
-        <w:divId w:val="555312002"/>
+        <w:divId w:val="336660132"/>
         <w:rPr>
           <w:lang w:val="en"/>
         </w:rPr>
@@ -7962,6 +7885,7 @@
         <w:rPr>
           <w:lang w:val="en"/>
         </w:rPr>
+        <w:lastRenderedPageBreak/>
         <w:t>Rise 360 · 5.2</w:t>
       </w:r>
     </w:p>
@@ -7983,7 +7907,7 @@
       </w:tblGrid>
       <w:tr>
         <w:trPr>
-          <w:divId w:val="555312002"/>
+          <w:divId w:val="336660132"/>
           <w:cantSplit/>
         </w:trPr>
         <w:tc>
@@ -8065,14 +7989,14 @@
                 <w:sz w:val="28"/>
                 <w:szCs w:val="28"/>
               </w:rPr>
-              <w:t>Button: Rise Continue. No custom image.</w:t>
+              <w:t>Rise Continue button.</w:t>
             </w:r>
           </w:p>
         </w:tc>
       </w:tr>
       <w:tr>
         <w:trPr>
-          <w:divId w:val="555312002"/>
+          <w:divId w:val="336660132"/>
           <w:cantSplit/>
         </w:trPr>
         <w:tc>
@@ -8161,7 +8085,7 @@
       </w:tr>
       <w:tr>
         <w:trPr>
-          <w:divId w:val="555312002"/>
+          <w:divId w:val="336660132"/>
           <w:cantSplit/>
         </w:trPr>
         <w:tc>
@@ -8250,7 +8174,7 @@
       </w:tr>
       <w:tr>
         <w:trPr>
-          <w:divId w:val="555312002"/>
+          <w:divId w:val="336660132"/>
           <w:cantSplit/>
         </w:trPr>
         <w:tc>
@@ -8356,7 +8280,7 @@
       <w:pPr>
         <w:pStyle w:val="card-title"/>
         <w:keepLines/>
-        <w:divId w:val="1960911324"/>
+        <w:divId w:val="1738284887"/>
         <w:rPr>
           <w:lang w:val="en"/>
         </w:rPr>
@@ -8386,7 +8310,7 @@
       </w:tblGrid>
       <w:tr>
         <w:trPr>
-          <w:divId w:val="1960911324"/>
+          <w:divId w:val="1738284887"/>
           <w:cantSplit/>
         </w:trPr>
         <w:tc>
@@ -8456,26 +8380,19 @@
               <w:keepLines/>
               <w:rPr>
                 <w:rFonts w:ascii="Calibri" w:eastAsia="Times New Roman" w:hAnsi="Calibri" w:cs="Calibri"/>
-                <w:color w:val="3B3B3B"/>
-                <w:sz w:val="28"/>
-                <w:szCs w:val="28"/>
-              </w:rPr>
-            </w:pPr>
-            <w:r>
-              <w:rPr>
-                <w:rFonts w:ascii="Calibri" w:eastAsia="Times New Roman" w:hAnsi="Calibri" w:cs="Calibri"/>
-                <w:color w:val="3B3B3B"/>
-                <w:sz w:val="28"/>
-                <w:szCs w:val="28"/>
-              </w:rPr>
-              <w:t>None. Sidebar label only.</w:t>
-            </w:r>
+                <w:b/>
+                <w:bCs/>
+                <w:color w:val="3B3B3B"/>
+                <w:sz w:val="32"/>
+                <w:szCs w:val="32"/>
+              </w:rPr>
+            </w:pPr>
           </w:p>
         </w:tc>
       </w:tr>
       <w:tr>
         <w:trPr>
-          <w:divId w:val="1960911324"/>
+          <w:divId w:val="1738284887"/>
           <w:cantSplit/>
         </w:trPr>
         <w:tc>
@@ -8564,7 +8481,7 @@
       </w:tr>
       <w:tr>
         <w:trPr>
-          <w:divId w:val="1960911324"/>
+          <w:divId w:val="1738284887"/>
           <w:cantSplit/>
         </w:trPr>
         <w:tc>
@@ -8653,7 +8570,7 @@
       </w:tr>
       <w:tr>
         <w:trPr>
-          <w:divId w:val="1960911324"/>
+          <w:divId w:val="1738284887"/>
           <w:cantSplit/>
         </w:trPr>
         <w:tc>
@@ -8759,7 +8676,7 @@
       <w:pPr>
         <w:pStyle w:val="card-title"/>
         <w:keepLines/>
-        <w:divId w:val="445858054"/>
+        <w:divId w:val="1071151398"/>
         <w:rPr>
           <w:lang w:val="en"/>
         </w:rPr>
@@ -8768,6 +8685,7 @@
         <w:rPr>
           <w:lang w:val="en"/>
         </w:rPr>
+        <w:lastRenderedPageBreak/>
         <w:t>Rise 360 · 6.1</w:t>
       </w:r>
     </w:p>
@@ -8789,7 +8707,7 @@
       </w:tblGrid>
       <w:tr>
         <w:trPr>
-          <w:divId w:val="445858054"/>
+          <w:divId w:val="1071151398"/>
           <w:cantSplit/>
         </w:trPr>
         <w:tc>
@@ -8871,24 +8789,14 @@
                 <w:sz w:val="28"/>
                 <w:szCs w:val="28"/>
               </w:rPr>
-              <w:t>Slide / block background: solid paper #FFFFFF. No background photograph. No 360° image.</w:t>
-            </w:r>
-            <w:r>
-              <w:rPr>
-                <w:rFonts w:ascii="Calibri" w:eastAsia="Times New Roman" w:hAnsi="Calibri" w:cs="Calibri"/>
-                <w:color w:val="3B3B3B"/>
-                <w:sz w:val="28"/>
-                <w:szCs w:val="28"/>
-              </w:rPr>
-              <w:br/>
-              <w:t>No illustration of an email.</w:t>
+              <w:t>Slide / block background: solid paper #FFFFFF.</w:t>
             </w:r>
           </w:p>
         </w:tc>
       </w:tr>
       <w:tr>
         <w:trPr>
-          <w:divId w:val="445858054"/>
+          <w:divId w:val="1071151398"/>
           <w:cantSplit/>
         </w:trPr>
         <w:tc>
@@ -8977,7 +8885,7 @@
       </w:tr>
       <w:tr>
         <w:trPr>
-          <w:divId w:val="445858054"/>
+          <w:divId w:val="1071151398"/>
           <w:cantSplit/>
         </w:trPr>
         <w:tc>
@@ -9066,7 +8974,7 @@
       </w:tr>
       <w:tr>
         <w:trPr>
-          <w:divId w:val="445858054"/>
+          <w:divId w:val="1071151398"/>
           <w:cantSplit/>
         </w:trPr>
         <w:tc>
@@ -9172,7 +9080,7 @@
       <w:pPr>
         <w:pStyle w:val="card-title"/>
         <w:keepLines/>
-        <w:divId w:val="1258060474"/>
+        <w:divId w:val="1174606550"/>
         <w:rPr>
           <w:lang w:val="en"/>
         </w:rPr>
@@ -9202,7 +9110,7 @@
       </w:tblGrid>
       <w:tr>
         <w:trPr>
-          <w:divId w:val="1258060474"/>
+          <w:divId w:val="1174606550"/>
           <w:cantSplit/>
         </w:trPr>
         <w:tc>
@@ -9284,14 +9192,14 @@
                 <w:sz w:val="28"/>
                 <w:szCs w:val="28"/>
               </w:rPr>
-              <w:t>Rise multiple-choice control. No extra assets.</w:t>
+              <w:t>Rise multiple-choice control.</w:t>
             </w:r>
           </w:p>
         </w:tc>
       </w:tr>
       <w:tr>
         <w:trPr>
-          <w:divId w:val="1258060474"/>
+          <w:divId w:val="1174606550"/>
           <w:cantSplit/>
         </w:trPr>
         <w:tc>
@@ -9380,7 +9288,7 @@
       </w:tr>
       <w:tr>
         <w:trPr>
-          <w:divId w:val="1258060474"/>
+          <w:divId w:val="1174606550"/>
           <w:cantSplit/>
         </w:trPr>
         <w:tc>
@@ -9507,7 +9415,7 @@
       </w:tr>
       <w:tr>
         <w:trPr>
-          <w:divId w:val="1258060474"/>
+          <w:divId w:val="1174606550"/>
           <w:cantSplit/>
         </w:trPr>
         <w:tc>
@@ -9613,7 +9521,7 @@
       <w:pPr>
         <w:pStyle w:val="card-title"/>
         <w:keepLines/>
-        <w:divId w:val="768744676"/>
+        <w:divId w:val="608511699"/>
         <w:rPr>
           <w:lang w:val="en"/>
         </w:rPr>
@@ -9622,6 +9530,7 @@
         <w:rPr>
           <w:lang w:val="en"/>
         </w:rPr>
+        <w:lastRenderedPageBreak/>
         <w:t>Rise 360 · 6.3</w:t>
       </w:r>
     </w:p>
@@ -9643,7 +9552,7 @@
       </w:tblGrid>
       <w:tr>
         <w:trPr>
-          <w:divId w:val="768744676"/>
+          <w:divId w:val="608511699"/>
           <w:cantSplit/>
         </w:trPr>
         <w:tc>
@@ -9725,14 +9634,14 @@
                 <w:sz w:val="28"/>
                 <w:szCs w:val="28"/>
               </w:rPr>
-              <w:t>Button: Rise Submit. No custom image.</w:t>
+              <w:t>Rise Submit button.</w:t>
             </w:r>
           </w:p>
         </w:tc>
       </w:tr>
       <w:tr>
         <w:trPr>
-          <w:divId w:val="768744676"/>
+          <w:divId w:val="608511699"/>
           <w:cantSplit/>
         </w:trPr>
         <w:tc>
@@ -9821,7 +9730,7 @@
       </w:tr>
       <w:tr>
         <w:trPr>
-          <w:divId w:val="768744676"/>
+          <w:divId w:val="608511699"/>
           <w:cantSplit/>
         </w:trPr>
         <w:tc>
@@ -9910,7 +9819,7 @@
       </w:tr>
       <w:tr>
         <w:trPr>
-          <w:divId w:val="768744676"/>
+          <w:divId w:val="608511699"/>
           <w:cantSplit/>
         </w:trPr>
         <w:tc>
@@ -10016,7 +9925,7 @@
       <w:pPr>
         <w:pStyle w:val="card-title"/>
         <w:keepLines/>
-        <w:divId w:val="453838803"/>
+        <w:divId w:val="543252752"/>
         <w:rPr>
           <w:lang w:val="en"/>
         </w:rPr>
@@ -10046,7 +9955,7 @@
       </w:tblGrid>
       <w:tr>
         <w:trPr>
-          <w:divId w:val="453838803"/>
+          <w:divId w:val="543252752"/>
           <w:cantSplit/>
         </w:trPr>
         <w:tc>
@@ -10135,7 +10044,7 @@
       </w:tr>
       <w:tr>
         <w:trPr>
-          <w:divId w:val="453838803"/>
+          <w:divId w:val="543252752"/>
           <w:cantSplit/>
         </w:trPr>
         <w:tc>
@@ -10224,7 +10133,7 @@
       </w:tr>
       <w:tr>
         <w:trPr>
-          <w:divId w:val="453838803"/>
+          <w:divId w:val="543252752"/>
           <w:cantSplit/>
         </w:trPr>
         <w:tc>
@@ -10332,7 +10241,7 @@
       </w:tr>
       <w:tr>
         <w:trPr>
-          <w:divId w:val="453838803"/>
+          <w:divId w:val="543252752"/>
           <w:cantSplit/>
         </w:trPr>
         <w:tc>
@@ -10438,7 +10347,7 @@
       <w:pPr>
         <w:pStyle w:val="card-title"/>
         <w:keepLines/>
-        <w:divId w:val="556480434"/>
+        <w:divId w:val="794174411"/>
         <w:rPr>
           <w:lang w:val="en"/>
         </w:rPr>
@@ -10447,6 +10356,7 @@
         <w:rPr>
           <w:lang w:val="en"/>
         </w:rPr>
+        <w:lastRenderedPageBreak/>
         <w:t>Rise 360 · 6.5</w:t>
       </w:r>
     </w:p>
@@ -10468,7 +10378,7 @@
       </w:tblGrid>
       <w:tr>
         <w:trPr>
-          <w:divId w:val="556480434"/>
+          <w:divId w:val="794174411"/>
           <w:cantSplit/>
         </w:trPr>
         <w:tc>
@@ -10557,7 +10467,7 @@
       </w:tr>
       <w:tr>
         <w:trPr>
-          <w:divId w:val="556480434"/>
+          <w:divId w:val="794174411"/>
           <w:cantSplit/>
         </w:trPr>
         <w:tc>
@@ -10646,7 +10556,7 @@
       </w:tr>
       <w:tr>
         <w:trPr>
-          <w:divId w:val="556480434"/>
+          <w:divId w:val="794174411"/>
           <w:cantSplit/>
         </w:trPr>
         <w:tc>
@@ -10747,6 +10657,14 @@
                 <w:szCs w:val="28"/>
               </w:rPr>
               <w:br/>
+            </w:r>
+            <w:r>
+              <w:rPr>
+                <w:rFonts w:ascii="Calibri" w:eastAsia="Times New Roman" w:hAnsi="Calibri" w:cs="Calibri"/>
+                <w:color w:val="3B3B3B"/>
+                <w:sz w:val="28"/>
+                <w:szCs w:val="28"/>
+              </w:rPr>
               <w:t>One email is still personal data. Personal drives are not the contractor workaround.</w:t>
             </w:r>
           </w:p>
@@ -10754,7 +10672,7 @@
       </w:tr>
       <w:tr>
         <w:trPr>
-          <w:divId w:val="556480434"/>
+          <w:divId w:val="794174411"/>
           <w:cantSplit/>
         </w:trPr>
         <w:tc>
@@ -10860,7 +10778,7 @@
       <w:pPr>
         <w:pStyle w:val="card-title"/>
         <w:keepLines/>
-        <w:divId w:val="1400246471"/>
+        <w:divId w:val="1807820645"/>
         <w:rPr>
           <w:lang w:val="en"/>
         </w:rPr>
@@ -10890,7 +10808,7 @@
       </w:tblGrid>
       <w:tr>
         <w:trPr>
-          <w:divId w:val="1400246471"/>
+          <w:divId w:val="1807820645"/>
           <w:cantSplit/>
         </w:trPr>
         <w:tc>
@@ -10972,14 +10890,14 @@
                 <w:sz w:val="28"/>
                 <w:szCs w:val="28"/>
               </w:rPr>
-              <w:t>Button: Rise Continue. No custom image.</w:t>
+              <w:t>Rise Continue button.</w:t>
             </w:r>
           </w:p>
         </w:tc>
       </w:tr>
       <w:tr>
         <w:trPr>
-          <w:divId w:val="1400246471"/>
+          <w:divId w:val="1807820645"/>
           <w:cantSplit/>
         </w:trPr>
         <w:tc>
@@ -11068,7 +10986,7 @@
       </w:tr>
       <w:tr>
         <w:trPr>
-          <w:divId w:val="1400246471"/>
+          <w:divId w:val="1807820645"/>
           <w:cantSplit/>
         </w:trPr>
         <w:tc>
@@ -11157,7 +11075,7 @@
       </w:tr>
       <w:tr>
         <w:trPr>
-          <w:divId w:val="1400246471"/>
+          <w:divId w:val="1807820645"/>
           <w:cantSplit/>
         </w:trPr>
         <w:tc>
@@ -11263,7 +11181,7 @@
       <w:pPr>
         <w:pStyle w:val="card-title"/>
         <w:keepLines/>
-        <w:divId w:val="760954630"/>
+        <w:divId w:val="190607343"/>
         <w:rPr>
           <w:lang w:val="en"/>
         </w:rPr>
@@ -11272,6 +11190,7 @@
         <w:rPr>
           <w:lang w:val="en"/>
         </w:rPr>
+        <w:lastRenderedPageBreak/>
         <w:t>Rise 360 · 7.0</w:t>
       </w:r>
     </w:p>
@@ -11293,7 +11212,7 @@
       </w:tblGrid>
       <w:tr>
         <w:trPr>
-          <w:divId w:val="760954630"/>
+          <w:divId w:val="190607343"/>
           <w:cantSplit/>
         </w:trPr>
         <w:tc>
@@ -11363,26 +11282,19 @@
               <w:keepLines/>
               <w:rPr>
                 <w:rFonts w:ascii="Calibri" w:eastAsia="Times New Roman" w:hAnsi="Calibri" w:cs="Calibri"/>
-                <w:color w:val="3B3B3B"/>
-                <w:sz w:val="28"/>
-                <w:szCs w:val="28"/>
-              </w:rPr>
-            </w:pPr>
-            <w:r>
-              <w:rPr>
-                <w:rFonts w:ascii="Calibri" w:eastAsia="Times New Roman" w:hAnsi="Calibri" w:cs="Calibri"/>
-                <w:color w:val="3B3B3B"/>
-                <w:sz w:val="28"/>
-                <w:szCs w:val="28"/>
-              </w:rPr>
-              <w:t>None. Sidebar label only.</w:t>
-            </w:r>
+                <w:b/>
+                <w:bCs/>
+                <w:color w:val="3B3B3B"/>
+                <w:sz w:val="32"/>
+                <w:szCs w:val="32"/>
+              </w:rPr>
+            </w:pPr>
           </w:p>
         </w:tc>
       </w:tr>
       <w:tr>
         <w:trPr>
-          <w:divId w:val="760954630"/>
+          <w:divId w:val="190607343"/>
           <w:cantSplit/>
         </w:trPr>
         <w:tc>
@@ -11471,7 +11383,7 @@
       </w:tr>
       <w:tr>
         <w:trPr>
-          <w:divId w:val="760954630"/>
+          <w:divId w:val="190607343"/>
           <w:cantSplit/>
         </w:trPr>
         <w:tc>
@@ -11560,7 +11472,7 @@
       </w:tr>
       <w:tr>
         <w:trPr>
-          <w:divId w:val="760954630"/>
+          <w:divId w:val="190607343"/>
           <w:cantSplit/>
         </w:trPr>
         <w:tc>
@@ -11666,7 +11578,7 @@
       <w:pPr>
         <w:pStyle w:val="card-title"/>
         <w:keepLines/>
-        <w:divId w:val="224031097"/>
+        <w:divId w:val="2096323568"/>
         <w:rPr>
           <w:lang w:val="en"/>
         </w:rPr>
@@ -11696,19 +11608,19 @@
       </w:tblGrid>
       <w:tr>
         <w:trPr>
-          <w:divId w:val="224031097"/>
+          <w:divId w:val="2096323568"/>
           <w:cantSplit/>
         </w:trPr>
         <w:tc>
           <w:tcPr>
             <w:tcW w:w="2400" w:type="dxa"/>
             <w:tcBorders>
-              <w:top w:val="single" w:sz="6" w:space="0" w:color="3B3B3B"/>
-              <w:left w:val="single" w:sz="6" w:space="0" w:color="3B3B3B"/>
-              <w:bottom w:val="single" w:sz="6" w:space="0" w:color="3B3B3B"/>
-              <w:right w:val="single" w:sz="6" w:space="0" w:color="3B3B3B"/>
-            </w:tcBorders>
-            <w:shd w:val="clear" w:color="auto" w:fill="E6E6E6"/>
+              <w:top w:val="single" w:sz="12" w:space="0" w:color="3B3B3B"/>
+              <w:left w:val="single" w:sz="12" w:space="0" w:color="3B3B3B"/>
+              <w:bottom w:val="single" w:sz="12" w:space="0" w:color="3B3B3B"/>
+              <w:right w:val="single" w:sz="12" w:space="0" w:color="3B3B3B"/>
+            </w:tcBorders>
+            <w:shd w:val="clear" w:color="auto" w:fill="FFFFFF"/>
             <w:tcMar>
               <w:top w:w="160" w:type="dxa"/>
               <w:left w:w="200" w:type="dxa"/>
@@ -11748,51 +11660,51 @@
             <w:tcW w:w="12999" w:type="dxa"/>
             <w:tcBorders>
               <w:top w:val="single" w:sz="6" w:space="0" w:color="3B3B3B"/>
-              <w:left w:val="single" w:sz="6" w:space="0" w:color="3B3B3B"/>
-              <w:bottom w:val="single" w:sz="6" w:space="0" w:color="3B3B3B"/>
-              <w:right w:val="single" w:sz="6" w:space="0" w:color="3B3B3B"/>
-            </w:tcBorders>
-            <w:tcMar>
-              <w:top w:w="160" w:type="dxa"/>
-              <w:left w:w="200" w:type="dxa"/>
-              <w:bottom w:w="160" w:type="dxa"/>
-              <w:right w:w="200" w:type="dxa"/>
-            </w:tcMar>
-            <w:hideMark/>
-          </w:tcPr>
-          <w:p>
-            <w:pPr>
-              <w:keepNext/>
-              <w:keepLines/>
-              <w:rPr>
-                <w:rFonts w:ascii="Calibri" w:eastAsia="Times New Roman" w:hAnsi="Calibri" w:cs="Calibri"/>
-                <w:color w:val="3B3B3B"/>
-                <w:sz w:val="28"/>
-                <w:szCs w:val="28"/>
-              </w:rPr>
-            </w:pPr>
-            <w:r>
-              <w:rPr>
-                <w:rFonts w:ascii="Calibri" w:eastAsia="Times New Roman" w:hAnsi="Calibri" w:cs="Calibri"/>
-                <w:color w:val="3B3B3B"/>
-                <w:sz w:val="28"/>
-                <w:szCs w:val="28"/>
-              </w:rPr>
-              <w:t>Optional later: job-aid PDF as a text link only when the public URL is the one you want. File name if attached: before-you-paste-classify.pdf. Do not put a URL on screen until it is live.</w:t>
+              <w:left w:val="single" w:sz="12" w:space="0" w:color="3B3B3B"/>
+              <w:bottom w:val="single" w:sz="6" w:space="0" w:color="3B3B3B"/>
+              <w:right w:val="single" w:sz="6" w:space="0" w:color="3B3B3B"/>
+            </w:tcBorders>
+            <w:tcMar>
+              <w:top w:w="160" w:type="dxa"/>
+              <w:left w:w="200" w:type="dxa"/>
+              <w:bottom w:w="160" w:type="dxa"/>
+              <w:right w:w="200" w:type="dxa"/>
+            </w:tcMar>
+            <w:hideMark/>
+          </w:tcPr>
+          <w:p>
+            <w:pPr>
+              <w:keepNext/>
+              <w:keepLines/>
+              <w:rPr>
+                <w:rFonts w:ascii="Calibri" w:eastAsia="Times New Roman" w:hAnsi="Calibri" w:cs="Calibri"/>
+                <w:color w:val="3B3B3B"/>
+                <w:sz w:val="28"/>
+                <w:szCs w:val="28"/>
+              </w:rPr>
+            </w:pPr>
+            <w:r>
+              <w:rPr>
+                <w:rFonts w:ascii="Calibri" w:eastAsia="Times New Roman" w:hAnsi="Calibri" w:cs="Calibri"/>
+                <w:color w:val="3B3B3B"/>
+                <w:sz w:val="28"/>
+                <w:szCs w:val="28"/>
+              </w:rPr>
+              <w:t>Slide / block background: solid paper #FFFFFF.</w:t>
             </w:r>
           </w:p>
         </w:tc>
       </w:tr>
       <w:tr>
         <w:trPr>
-          <w:divId w:val="224031097"/>
+          <w:divId w:val="2096323568"/>
           <w:cantSplit/>
         </w:trPr>
         <w:tc>
           <w:tcPr>
             <w:tcW w:w="2400" w:type="dxa"/>
             <w:tcBorders>
-              <w:top w:val="single" w:sz="6" w:space="0" w:color="3B3B3B"/>
+              <w:top w:val="single" w:sz="12" w:space="0" w:color="3B3B3B"/>
               <w:left w:val="single" w:sz="6" w:space="0" w:color="3B3B3B"/>
               <w:bottom w:val="single" w:sz="6" w:space="0" w:color="3B3B3B"/>
               <w:right w:val="single" w:sz="6" w:space="0" w:color="3B3B3B"/>
@@ -11874,7 +11786,7 @@
       </w:tr>
       <w:tr>
         <w:trPr>
-          <w:divId w:val="224031097"/>
+          <w:divId w:val="2096323568"/>
           <w:cantSplit/>
         </w:trPr>
         <w:tc>
@@ -11982,7 +11894,7 @@
       </w:tr>
       <w:tr>
         <w:trPr>
-          <w:divId w:val="224031097"/>
+          <w:divId w:val="2096323568"/>
           <w:cantSplit/>
         </w:trPr>
         <w:tc>
@@ -12088,7 +12000,7 @@
       <w:pPr>
         <w:pStyle w:val="card-title"/>
         <w:keepLines/>
-        <w:divId w:val="199904096"/>
+        <w:divId w:val="1748769873"/>
         <w:rPr>
           <w:lang w:val="en"/>
         </w:rPr>
@@ -12097,6 +12009,7 @@
         <w:rPr>
           <w:lang w:val="en"/>
         </w:rPr>
+        <w:lastRenderedPageBreak/>
         <w:t>Rise 360 · 7.2</w:t>
       </w:r>
     </w:p>
@@ -12118,7 +12031,7 @@
       </w:tblGrid>
       <w:tr>
         <w:trPr>
-          <w:divId w:val="199904096"/>
+          <w:divId w:val="1748769873"/>
           <w:cantSplit/>
         </w:trPr>
         <w:tc>
@@ -12200,14 +12113,14 @@
                 <w:sz w:val="28"/>
                 <w:szCs w:val="28"/>
               </w:rPr>
-              <w:t>Rise default completion chrome. Do not design a fake certificate.</w:t>
+              <w:t>Rise default completion chrome.</w:t>
             </w:r>
           </w:p>
         </w:tc>
       </w:tr>
       <w:tr>
         <w:trPr>
-          <w:divId w:val="199904096"/>
+          <w:divId w:val="1748769873"/>
           <w:cantSplit/>
         </w:trPr>
         <w:tc>
@@ -12296,7 +12209,7 @@
       </w:tr>
       <w:tr>
         <w:trPr>
-          <w:divId w:val="199904096"/>
+          <w:divId w:val="1748769873"/>
           <w:cantSplit/>
         </w:trPr>
         <w:tc>
@@ -12405,7 +12318,7 @@
       </w:tr>
       <w:tr>
         <w:trPr>
-          <w:divId w:val="199904096"/>
+          <w:divId w:val="1748769873"/>
           <w:cantSplit/>
         </w:trPr>
         <w:tc>
@@ -12525,6 +12438,7 @@
         <w:rPr>
           <w:lang w:val="en"/>
         </w:rPr>
+        <w:lastRenderedPageBreak/>
         <w:t>Storyline 360 — scenes, slides, layers</w:t>
       </w:r>
     </w:p>
@@ -12532,7 +12446,7 @@
       <w:pPr>
         <w:pStyle w:val="card-title"/>
         <w:keepLines/>
-        <w:divId w:val="1244530946"/>
+        <w:divId w:val="1098063148"/>
         <w:rPr>
           <w:lang w:val="en"/>
         </w:rPr>
@@ -12562,7 +12476,7 @@
       </w:tblGrid>
       <w:tr>
         <w:trPr>
-          <w:divId w:val="1244530946"/>
+          <w:divId w:val="1098063148"/>
           <w:cantSplit/>
         </w:trPr>
         <w:tc>
@@ -12644,14 +12558,14 @@
                 <w:sz w:val="28"/>
                 <w:szCs w:val="28"/>
               </w:rPr>
-              <w:t>Storyline player chrome. Menu, Resources, Exit, Prev, Next. No custom skin graphic. Player: ink on paper.</w:t>
+              <w:t>Storyline player chrome: Menu, Resources, Exit, Prev, Next. Ink on paper.</w:t>
             </w:r>
           </w:p>
         </w:tc>
       </w:tr>
       <w:tr>
         <w:trPr>
-          <w:divId w:val="1244530946"/>
+          <w:divId w:val="1098063148"/>
           <w:cantSplit/>
         </w:trPr>
         <w:tc>
@@ -12740,7 +12654,7 @@
       </w:tr>
       <w:tr>
         <w:trPr>
-          <w:divId w:val="1244530946"/>
+          <w:divId w:val="1098063148"/>
           <w:cantSplit/>
         </w:trPr>
         <w:tc>
@@ -12869,7 +12783,7 @@
       </w:tr>
       <w:tr>
         <w:trPr>
-          <w:divId w:val="1244530946"/>
+          <w:divId w:val="1098063148"/>
           <w:cantSplit/>
         </w:trPr>
         <w:tc>
@@ -12975,7 +12889,7 @@
       <w:pPr>
         <w:pStyle w:val="card-title"/>
         <w:keepLines/>
-        <w:divId w:val="972632637"/>
+        <w:divId w:val="1685014773"/>
         <w:rPr>
           <w:lang w:val="en"/>
         </w:rPr>
@@ -12984,6 +12898,7 @@
         <w:rPr>
           <w:lang w:val="en"/>
         </w:rPr>
+        <w:lastRenderedPageBreak/>
         <w:t>Storyline 360 · 1.1</w:t>
       </w:r>
     </w:p>
@@ -13005,7 +12920,7 @@
       </w:tblGrid>
       <w:tr>
         <w:trPr>
-          <w:divId w:val="972632637"/>
+          <w:divId w:val="1685014773"/>
           <w:cantSplit/>
         </w:trPr>
         <w:tc>
@@ -13087,7 +13002,7 @@
                 <w:sz w:val="28"/>
                 <w:szCs w:val="28"/>
               </w:rPr>
-              <w:t>Slide / block background: solid paper #FFFFFF. No background photograph. No 360° image.</w:t>
+              <w:t>Slide / block background: solid paper #FFFFFF.</w:t>
             </w:r>
             <w:r>
               <w:rPr>
@@ -13097,24 +13012,14 @@
                 <w:szCs w:val="28"/>
               </w:rPr>
               <w:br/>
-              <w:t>Type (learner-facing): Open Sauce One 400/500/600 and League Gothic Regular. Install on Windows before trial week. Embed on publish.</w:t>
-            </w:r>
-            <w:r>
-              <w:rPr>
-                <w:rFonts w:ascii="Calibri" w:eastAsia="Times New Roman" w:hAnsi="Calibri" w:cs="Calibri"/>
-                <w:color w:val="3B3B3B"/>
-                <w:sz w:val="28"/>
-                <w:szCs w:val="28"/>
-              </w:rPr>
-              <w:br/>
-              <w:t>Start button: rectangle, paper fill, 2 px ink outline. No logo. No photo.</w:t>
+              <w:t>Start button: rectangle, paper fill, 2 px ink outline.</w:t>
             </w:r>
           </w:p>
         </w:tc>
       </w:tr>
       <w:tr>
         <w:trPr>
-          <w:divId w:val="972632637"/>
+          <w:divId w:val="1685014773"/>
           <w:cantSplit/>
         </w:trPr>
         <w:tc>
@@ -13203,7 +13108,7 @@
       </w:tr>
       <w:tr>
         <w:trPr>
-          <w:divId w:val="972632637"/>
+          <w:divId w:val="1685014773"/>
           <w:cantSplit/>
         </w:trPr>
         <w:tc>
@@ -13330,7 +13235,7 @@
       </w:tr>
       <w:tr>
         <w:trPr>
-          <w:divId w:val="972632637"/>
+          <w:divId w:val="1685014773"/>
           <w:cantSplit/>
         </w:trPr>
         <w:tc>
@@ -13436,7 +13341,7 @@
       <w:pPr>
         <w:pStyle w:val="card-title"/>
         <w:keepLines/>
-        <w:divId w:val="711225025"/>
+        <w:divId w:val="284820274"/>
         <w:rPr>
           <w:lang w:val="en"/>
         </w:rPr>
@@ -13445,6 +13350,7 @@
         <w:rPr>
           <w:lang w:val="en"/>
         </w:rPr>
+        <w:lastRenderedPageBreak/>
         <w:t>Storyline 360 · 1.2</w:t>
       </w:r>
     </w:p>
@@ -13466,7 +13372,7 @@
       </w:tblGrid>
       <w:tr>
         <w:trPr>
-          <w:divId w:val="711225025"/>
+          <w:divId w:val="284820274"/>
           <w:cantSplit/>
         </w:trPr>
         <w:tc>
@@ -13548,24 +13454,14 @@
                 <w:sz w:val="28"/>
                 <w:szCs w:val="28"/>
               </w:rPr>
-              <w:t>Slide / block background: solid paper #FFFFFF. No background photograph. No 360° image.</w:t>
-            </w:r>
-            <w:r>
-              <w:rPr>
-                <w:rFonts w:ascii="Calibri" w:eastAsia="Times New Roman" w:hAnsi="Calibri" w:cs="Calibri"/>
-                <w:color w:val="3B3B3B"/>
-                <w:sz w:val="28"/>
-                <w:szCs w:val="28"/>
-              </w:rPr>
-              <w:br/>
-              <w:t>No audio file yet. If audio is added later, the on-screen words are the script. No waveform graphic.</w:t>
+              <w:t>Slide / block background: solid paper #FFFFFF.</w:t>
             </w:r>
           </w:p>
         </w:tc>
       </w:tr>
       <w:tr>
         <w:trPr>
-          <w:divId w:val="711225025"/>
+          <w:divId w:val="284820274"/>
           <w:cantSplit/>
         </w:trPr>
         <w:tc>
@@ -13654,7 +13550,7 @@
       </w:tr>
       <w:tr>
         <w:trPr>
-          <w:divId w:val="711225025"/>
+          <w:divId w:val="284820274"/>
           <w:cantSplit/>
         </w:trPr>
         <w:tc>
@@ -13781,7 +13677,7 @@
       </w:tr>
       <w:tr>
         <w:trPr>
-          <w:divId w:val="711225025"/>
+          <w:divId w:val="284820274"/>
           <w:cantSplit/>
         </w:trPr>
         <w:tc>
@@ -13887,7 +13783,7 @@
       <w:pPr>
         <w:pStyle w:val="card-title"/>
         <w:keepLines/>
-        <w:divId w:val="1939680402"/>
+        <w:divId w:val="1173179256"/>
         <w:rPr>
           <w:lang w:val="en"/>
         </w:rPr>
@@ -13896,6 +13792,7 @@
         <w:rPr>
           <w:lang w:val="en"/>
         </w:rPr>
+        <w:lastRenderedPageBreak/>
         <w:t>Storyline 360 · 2.1</w:t>
       </w:r>
     </w:p>
@@ -13917,7 +13814,7 @@
       </w:tblGrid>
       <w:tr>
         <w:trPr>
-          <w:divId w:val="1939680402"/>
+          <w:divId w:val="1173179256"/>
           <w:cantSplit/>
         </w:trPr>
         <w:tc>
@@ -13999,7 +13896,7 @@
                 <w:sz w:val="28"/>
                 <w:szCs w:val="28"/>
               </w:rPr>
-              <w:t>Slide / block background: solid paper #FFFFFF. No background photograph. No 360° image.</w:t>
+              <w:t>Slide / block background: solid paper #FFFFFF.</w:t>
             </w:r>
             <w:r>
               <w:rPr>
@@ -14009,7 +13906,7 @@
                 <w:szCs w:val="28"/>
               </w:rPr>
               <w:br/>
-              <w:t>Character asset: “Alex, remote staff.” Storyline illustrated character or caption bar only. No photograph unless Keith supplies one. Alt: Alex, remote staff.</w:t>
+              <w:t>Caption: Alex, remote staff.</w:t>
             </w:r>
             <w:r>
               <w:rPr>
@@ -14019,14 +13916,14 @@
                 <w:szCs w:val="28"/>
               </w:rPr>
               <w:br/>
-              <w:t>Two choice buttons (no icons).</w:t>
+              <w:t>Two choice buttons.</w:t>
             </w:r>
           </w:p>
         </w:tc>
       </w:tr>
       <w:tr>
         <w:trPr>
-          <w:divId w:val="1939680402"/>
+          <w:divId w:val="1173179256"/>
           <w:cantSplit/>
         </w:trPr>
         <w:tc>
@@ -14115,7 +14012,7 @@
       </w:tr>
       <w:tr>
         <w:trPr>
-          <w:divId w:val="1939680402"/>
+          <w:divId w:val="1173179256"/>
           <w:cantSplit/>
         </w:trPr>
         <w:tc>
@@ -14280,7 +14177,7 @@
       </w:tr>
       <w:tr>
         <w:trPr>
-          <w:divId w:val="1939680402"/>
+          <w:divId w:val="1173179256"/>
           <w:cantSplit/>
         </w:trPr>
         <w:tc>
@@ -14386,7 +14283,7 @@
       <w:pPr>
         <w:pStyle w:val="card-title"/>
         <w:keepLines/>
-        <w:divId w:val="1275559442"/>
+        <w:divId w:val="737631752"/>
         <w:rPr>
           <w:lang w:val="en"/>
         </w:rPr>
@@ -14395,6 +14292,7 @@
         <w:rPr>
           <w:lang w:val="en"/>
         </w:rPr>
+        <w:lastRenderedPageBreak/>
         <w:t>Storyline 360 · 2.2</w:t>
       </w:r>
     </w:p>
@@ -14416,7 +14314,7 @@
       </w:tblGrid>
       <w:tr>
         <w:trPr>
-          <w:divId w:val="1275559442"/>
+          <w:divId w:val="737631752"/>
           <w:cantSplit/>
         </w:trPr>
         <w:tc>
@@ -14498,7 +14396,7 @@
                 <w:sz w:val="28"/>
                 <w:szCs w:val="28"/>
               </w:rPr>
-              <w:t>Character asset: “Jordan, line manager.” Illustrated or caption bar. Alt: Jordan, line manager.</w:t>
+              <w:t>Captions: Jordan, line manager, and Alex, remote staff.</w:t>
             </w:r>
             <w:r>
               <w:rPr>
@@ -14515,7 +14413,7 @@
       </w:tr>
       <w:tr>
         <w:trPr>
-          <w:divId w:val="1275559442"/>
+          <w:divId w:val="737631752"/>
           <w:cantSplit/>
         </w:trPr>
         <w:tc>
@@ -14604,7 +14502,7 @@
       </w:tr>
       <w:tr>
         <w:trPr>
-          <w:divId w:val="1275559442"/>
+          <w:divId w:val="737631752"/>
           <w:cantSplit/>
         </w:trPr>
         <w:tc>
@@ -14769,7 +14667,7 @@
       </w:tr>
       <w:tr>
         <w:trPr>
-          <w:divId w:val="1275559442"/>
+          <w:divId w:val="737631752"/>
           <w:cantSplit/>
         </w:trPr>
         <w:tc>
@@ -14875,7 +14773,7 @@
       <w:pPr>
         <w:pStyle w:val="card-title"/>
         <w:keepLines/>
-        <w:divId w:val="1852379334"/>
+        <w:divId w:val="1845900108"/>
         <w:rPr>
           <w:lang w:val="en"/>
         </w:rPr>
@@ -14884,6 +14782,7 @@
         <w:rPr>
           <w:lang w:val="en"/>
         </w:rPr>
+        <w:lastRenderedPageBreak/>
         <w:t>Storyline 360 · 2.3</w:t>
       </w:r>
     </w:p>
@@ -14905,7 +14804,7 @@
       </w:tblGrid>
       <w:tr>
         <w:trPr>
-          <w:divId w:val="1852379334"/>
+          <w:divId w:val="1845900108"/>
           <w:cantSplit/>
         </w:trPr>
         <w:tc>
@@ -14987,7 +14886,7 @@
                 <w:sz w:val="28"/>
                 <w:szCs w:val="28"/>
               </w:rPr>
-              <w:t>Same Jordan / Alex assets as 2.2.</w:t>
+              <w:t>Captions: Alex, remote staff, and Jordan, line manager.</w:t>
             </w:r>
             <w:r>
               <w:rPr>
@@ -15004,7 +14903,7 @@
       </w:tr>
       <w:tr>
         <w:trPr>
-          <w:divId w:val="1852379334"/>
+          <w:divId w:val="1845900108"/>
           <w:cantSplit/>
         </w:trPr>
         <w:tc>
@@ -15093,7 +14992,7 @@
       </w:tr>
       <w:tr>
         <w:trPr>
-          <w:divId w:val="1852379334"/>
+          <w:divId w:val="1845900108"/>
           <w:cantSplit/>
         </w:trPr>
         <w:tc>
@@ -15258,7 +15157,7 @@
       </w:tr>
       <w:tr>
         <w:trPr>
-          <w:divId w:val="1852379334"/>
+          <w:divId w:val="1845900108"/>
           <w:cantSplit/>
         </w:trPr>
         <w:tc>
@@ -15364,7 +15263,7 @@
       <w:pPr>
         <w:pStyle w:val="card-title"/>
         <w:keepLines/>
-        <w:divId w:val="744300551"/>
+        <w:divId w:val="868880168"/>
         <w:rPr>
           <w:lang w:val="en"/>
         </w:rPr>
@@ -15373,6 +15272,7 @@
         <w:rPr>
           <w:lang w:val="en"/>
         </w:rPr>
+        <w:lastRenderedPageBreak/>
         <w:t>Storyline 360 · 2.4</w:t>
       </w:r>
     </w:p>
@@ -15394,7 +15294,7 @@
       </w:tblGrid>
       <w:tr>
         <w:trPr>
-          <w:divId w:val="744300551"/>
+          <w:divId w:val="868880168"/>
           <w:cantSplit/>
         </w:trPr>
         <w:tc>
@@ -15476,7 +15376,7 @@
                 <w:sz w:val="28"/>
                 <w:szCs w:val="28"/>
               </w:rPr>
-              <w:t>Slide / block background: solid paper #FFFFFF. No background photograph. No 360° image.</w:t>
+              <w:t>Slide / block background: solid paper #FFFFFF.</w:t>
             </w:r>
             <w:r>
               <w:rPr>
@@ -15486,7 +15386,7 @@
                 <w:szCs w:val="28"/>
               </w:rPr>
               <w:br/>
-              <w:t>Four type buttons (Public, Internal, Personal, Customer). No icons required.</w:t>
+              <w:t>Four type buttons: Public, Internal, Personal, Customer.</w:t>
             </w:r>
             <w:r>
               <w:rPr>
@@ -15513,7 +15413,7 @@
       </w:tr>
       <w:tr>
         <w:trPr>
-          <w:divId w:val="744300551"/>
+          <w:divId w:val="868880168"/>
           <w:cantSplit/>
         </w:trPr>
         <w:tc>
@@ -15602,7 +15502,7 @@
       </w:tr>
       <w:tr>
         <w:trPr>
-          <w:divId w:val="744300551"/>
+          <w:divId w:val="868880168"/>
           <w:cantSplit/>
         </w:trPr>
         <w:tc>
@@ -15759,7 +15659,7 @@
       </w:tr>
       <w:tr>
         <w:trPr>
-          <w:divId w:val="744300551"/>
+          <w:divId w:val="868880168"/>
           <w:cantSplit/>
         </w:trPr>
         <w:tc>
@@ -15865,7 +15765,7 @@
       <w:pPr>
         <w:pStyle w:val="card-title"/>
         <w:keepLines/>
-        <w:divId w:val="1663773344"/>
+        <w:divId w:val="96828597"/>
         <w:rPr>
           <w:lang w:val="en"/>
         </w:rPr>
@@ -15874,6 +15774,7 @@
         <w:rPr>
           <w:lang w:val="en"/>
         </w:rPr>
+        <w:lastRenderedPageBreak/>
         <w:t>Storyline 360 · 2.4 L-right</w:t>
       </w:r>
     </w:p>
@@ -15895,7 +15796,7 @@
       </w:tblGrid>
       <w:tr>
         <w:trPr>
-          <w:divId w:val="1663773344"/>
+          <w:divId w:val="96828597"/>
           <w:cantSplit/>
         </w:trPr>
         <w:tc>
@@ -15977,14 +15878,14 @@
                 <w:sz w:val="28"/>
                 <w:szCs w:val="28"/>
               </w:rPr>
-              <w:t>Layer panel fill: do wash #DBE0DC. Dim base slide. No close-X graphic.</w:t>
+              <w:t>Layer panel fill: do wash #DBE0DC. Dim on the base slide.</w:t>
             </w:r>
           </w:p>
         </w:tc>
       </w:tr>
       <w:tr>
         <w:trPr>
-          <w:divId w:val="1663773344"/>
+          <w:divId w:val="96828597"/>
           <w:cantSplit/>
         </w:trPr>
         <w:tc>
@@ -16073,7 +15974,7 @@
       </w:tr>
       <w:tr>
         <w:trPr>
-          <w:divId w:val="1663773344"/>
+          <w:divId w:val="96828597"/>
           <w:cantSplit/>
         </w:trPr>
         <w:tc>
@@ -16200,7 +16101,7 @@
       </w:tr>
       <w:tr>
         <w:trPr>
-          <w:divId w:val="1663773344"/>
+          <w:divId w:val="96828597"/>
           <w:cantSplit/>
         </w:trPr>
         <w:tc>
@@ -16306,7 +16207,7 @@
       <w:pPr>
         <w:pStyle w:val="card-title"/>
         <w:keepLines/>
-        <w:divId w:val="657223319"/>
+        <w:divId w:val="130640395"/>
         <w:rPr>
           <w:lang w:val="en"/>
         </w:rPr>
@@ -16315,6 +16216,7 @@
         <w:rPr>
           <w:lang w:val="en"/>
         </w:rPr>
+        <w:lastRenderedPageBreak/>
         <w:t>Storyline 360 · 2.4 L-wrong</w:t>
       </w:r>
     </w:p>
@@ -16336,7 +16238,7 @@
       </w:tblGrid>
       <w:tr>
         <w:trPr>
-          <w:divId w:val="657223319"/>
+          <w:divId w:val="130640395"/>
           <w:cantSplit/>
         </w:trPr>
         <w:tc>
@@ -16425,7 +16327,7 @@
       </w:tr>
       <w:tr>
         <w:trPr>
-          <w:divId w:val="657223319"/>
+          <w:divId w:val="130640395"/>
           <w:cantSplit/>
         </w:trPr>
         <w:tc>
@@ -16514,7 +16416,7 @@
       </w:tr>
       <w:tr>
         <w:trPr>
-          <w:divId w:val="657223319"/>
+          <w:divId w:val="130640395"/>
           <w:cantSplit/>
         </w:trPr>
         <w:tc>
@@ -16641,7 +16543,7 @@
       </w:tr>
       <w:tr>
         <w:trPr>
-          <w:divId w:val="657223319"/>
+          <w:divId w:val="130640395"/>
           <w:cantSplit/>
         </w:trPr>
         <w:tc>
@@ -16747,7 +16649,7 @@
       <w:pPr>
         <w:pStyle w:val="card-title"/>
         <w:keepLines/>
-        <w:divId w:val="116460507"/>
+        <w:divId w:val="338314626"/>
         <w:rPr>
           <w:lang w:val="en"/>
         </w:rPr>
@@ -16756,6 +16658,7 @@
         <w:rPr>
           <w:lang w:val="en"/>
         </w:rPr>
+        <w:lastRenderedPageBreak/>
         <w:t>Storyline 360 · 2.5</w:t>
       </w:r>
     </w:p>
@@ -16777,7 +16680,7 @@
       </w:tblGrid>
       <w:tr>
         <w:trPr>
-          <w:divId w:val="116460507"/>
+          <w:divId w:val="338314626"/>
           <w:cantSplit/>
         </w:trPr>
         <w:tc>
@@ -16869,24 +16772,14 @@
                 <w:szCs w:val="28"/>
               </w:rPr>
               <w:br/>
-              <w:t>Numerals 01 02 03: League Gothic.</w:t>
-            </w:r>
-            <w:r>
-              <w:rPr>
-                <w:rFonts w:ascii="Calibri" w:eastAsia="Times New Roman" w:hAnsi="Calibri" w:cs="Calibri"/>
-                <w:color w:val="3B3B3B"/>
-                <w:sz w:val="28"/>
-                <w:szCs w:val="28"/>
-              </w:rPr>
-              <w:br/>
-              <w:t>No 360° image. No photo.</w:t>
+              <w:t>Numerals 01 02 03 in League Gothic.</w:t>
             </w:r>
           </w:p>
         </w:tc>
       </w:tr>
       <w:tr>
         <w:trPr>
-          <w:divId w:val="116460507"/>
+          <w:divId w:val="338314626"/>
           <w:cantSplit/>
         </w:trPr>
         <w:tc>
@@ -16975,7 +16868,7 @@
       </w:tr>
       <w:tr>
         <w:trPr>
-          <w:divId w:val="116460507"/>
+          <w:divId w:val="338314626"/>
           <w:cantSplit/>
         </w:trPr>
         <w:tc>
@@ -17170,7 +17063,7 @@
       </w:tr>
       <w:tr>
         <w:trPr>
-          <w:divId w:val="116460507"/>
+          <w:divId w:val="338314626"/>
           <w:cantSplit/>
         </w:trPr>
         <w:tc>
@@ -17276,7 +17169,7 @@
       <w:pPr>
         <w:pStyle w:val="card-title"/>
         <w:keepLines/>
-        <w:divId w:val="816844515"/>
+        <w:divId w:val="995109429"/>
         <w:rPr>
           <w:lang w:val="en"/>
         </w:rPr>
@@ -17285,6 +17178,7 @@
         <w:rPr>
           <w:lang w:val="en"/>
         </w:rPr>
+        <w:lastRenderedPageBreak/>
         <w:t>Storyline 360 · 2.6</w:t>
       </w:r>
     </w:p>
@@ -17306,7 +17200,7 @@
       </w:tblGrid>
       <w:tr>
         <w:trPr>
-          <w:divId w:val="816844515"/>
+          <w:divId w:val="995109429"/>
           <w:cantSplit/>
         </w:trPr>
         <w:tc>
@@ -17388,14 +17282,24 @@
                 <w:sz w:val="28"/>
                 <w:szCs w:val="28"/>
               </w:rPr>
-              <w:t>Same Alex / Jordan assets. Three choice buttons. This is the scored item (Q1_approved_move).</w:t>
+              <w:t>Captions: Alex, remote staff, and Jordan, line manager.</w:t>
+            </w:r>
+            <w:r>
+              <w:rPr>
+                <w:rFonts w:ascii="Calibri" w:eastAsia="Times New Roman" w:hAnsi="Calibri" w:cs="Calibri"/>
+                <w:color w:val="3B3B3B"/>
+                <w:sz w:val="28"/>
+                <w:szCs w:val="28"/>
+              </w:rPr>
+              <w:br/>
+              <w:t>Three choice buttons.</w:t>
             </w:r>
           </w:p>
         </w:tc>
       </w:tr>
       <w:tr>
         <w:trPr>
-          <w:divId w:val="816844515"/>
+          <w:divId w:val="995109429"/>
           <w:cantSplit/>
         </w:trPr>
         <w:tc>
@@ -17484,7 +17388,7 @@
       </w:tr>
       <w:tr>
         <w:trPr>
-          <w:divId w:val="816844515"/>
+          <w:divId w:val="995109429"/>
           <w:cantSplit/>
         </w:trPr>
         <w:tc>
@@ -17668,7 +17572,7 @@
       </w:tr>
       <w:tr>
         <w:trPr>
-          <w:divId w:val="816844515"/>
+          <w:divId w:val="995109429"/>
           <w:cantSplit/>
         </w:trPr>
         <w:tc>
@@ -17774,7 +17678,7 @@
       <w:pPr>
         <w:pStyle w:val="card-title"/>
         <w:keepLines/>
-        <w:divId w:val="580918930"/>
+        <w:divId w:val="2027563053"/>
         <w:rPr>
           <w:lang w:val="en"/>
         </w:rPr>
@@ -17783,6 +17687,7 @@
         <w:rPr>
           <w:lang w:val="en"/>
         </w:rPr>
+        <w:lastRenderedPageBreak/>
         <w:t>Storyline 360 · 2.7</w:t>
       </w:r>
     </w:p>
@@ -17804,7 +17709,7 @@
       </w:tblGrid>
       <w:tr>
         <w:trPr>
-          <w:divId w:val="580918930"/>
+          <w:divId w:val="2027563053"/>
           <w:cantSplit/>
         </w:trPr>
         <w:tc>
@@ -17893,7 +17798,7 @@
       </w:tr>
       <w:tr>
         <w:trPr>
-          <w:divId w:val="580918930"/>
+          <w:divId w:val="2027563053"/>
           <w:cantSplit/>
         </w:trPr>
         <w:tc>
@@ -17982,7 +17887,7 @@
       </w:tr>
       <w:tr>
         <w:trPr>
-          <w:divId w:val="580918930"/>
+          <w:divId w:val="2027563053"/>
           <w:cantSplit/>
         </w:trPr>
         <w:tc>
@@ -18109,7 +18014,7 @@
       </w:tr>
       <w:tr>
         <w:trPr>
-          <w:divId w:val="580918930"/>
+          <w:divId w:val="2027563053"/>
           <w:cantSplit/>
         </w:trPr>
         <w:tc>
@@ -18215,7 +18120,7 @@
       <w:pPr>
         <w:pStyle w:val="card-title"/>
         <w:keepLines/>
-        <w:divId w:val="1630089044"/>
+        <w:divId w:val="1840073096"/>
         <w:rPr>
           <w:lang w:val="en"/>
         </w:rPr>
@@ -18224,6 +18129,7 @@
         <w:rPr>
           <w:lang w:val="en"/>
         </w:rPr>
+        <w:lastRenderedPageBreak/>
         <w:t>Storyline 360 · 2.8</w:t>
       </w:r>
     </w:p>
@@ -18245,7 +18151,7 @@
       </w:tblGrid>
       <w:tr>
         <w:trPr>
-          <w:divId w:val="1630089044"/>
+          <w:divId w:val="1840073096"/>
           <w:cantSplit/>
         </w:trPr>
         <w:tc>
@@ -18334,7 +18240,7 @@
       </w:tr>
       <w:tr>
         <w:trPr>
-          <w:divId w:val="1630089044"/>
+          <w:divId w:val="1840073096"/>
           <w:cantSplit/>
         </w:trPr>
         <w:tc>
@@ -18423,7 +18329,7 @@
       </w:tr>
       <w:tr>
         <w:trPr>
-          <w:divId w:val="1630089044"/>
+          <w:divId w:val="1840073096"/>
           <w:cantSplit/>
         </w:trPr>
         <w:tc>
@@ -18550,7 +18456,7 @@
       </w:tr>
       <w:tr>
         <w:trPr>
-          <w:divId w:val="1630089044"/>
+          <w:divId w:val="1840073096"/>
           <w:cantSplit/>
         </w:trPr>
         <w:tc>
@@ -18656,7 +18562,7 @@
       <w:pPr>
         <w:pStyle w:val="card-title"/>
         <w:keepLines/>
-        <w:divId w:val="1631934933"/>
+        <w:divId w:val="1220555053"/>
         <w:rPr>
           <w:lang w:val="en"/>
         </w:rPr>
@@ -18665,6 +18571,7 @@
         <w:rPr>
           <w:lang w:val="en"/>
         </w:rPr>
+        <w:lastRenderedPageBreak/>
         <w:t>Storyline 360 · 3.1</w:t>
       </w:r>
     </w:p>
@@ -18686,19 +18593,19 @@
       </w:tblGrid>
       <w:tr>
         <w:trPr>
-          <w:divId w:val="1631934933"/>
+          <w:divId w:val="1220555053"/>
           <w:cantSplit/>
         </w:trPr>
         <w:tc>
           <w:tcPr>
             <w:tcW w:w="2400" w:type="dxa"/>
             <w:tcBorders>
-              <w:top w:val="single" w:sz="6" w:space="0" w:color="3B3B3B"/>
-              <w:left w:val="single" w:sz="6" w:space="0" w:color="3B3B3B"/>
-              <w:bottom w:val="single" w:sz="6" w:space="0" w:color="3B3B3B"/>
-              <w:right w:val="single" w:sz="6" w:space="0" w:color="3B3B3B"/>
-            </w:tcBorders>
-            <w:shd w:val="clear" w:color="auto" w:fill="E6E6E6"/>
+              <w:top w:val="single" w:sz="12" w:space="0" w:color="3B3B3B"/>
+              <w:left w:val="single" w:sz="12" w:space="0" w:color="3B3B3B"/>
+              <w:bottom w:val="single" w:sz="12" w:space="0" w:color="3B3B3B"/>
+              <w:right w:val="single" w:sz="12" w:space="0" w:color="3B3B3B"/>
+            </w:tcBorders>
+            <w:shd w:val="clear" w:color="auto" w:fill="FFFFFF"/>
             <w:tcMar>
               <w:top w:w="160" w:type="dxa"/>
               <w:left w:w="200" w:type="dxa"/>
@@ -18738,51 +18645,51 @@
             <w:tcW w:w="12999" w:type="dxa"/>
             <w:tcBorders>
               <w:top w:val="single" w:sz="6" w:space="0" w:color="3B3B3B"/>
-              <w:left w:val="single" w:sz="6" w:space="0" w:color="3B3B3B"/>
-              <w:bottom w:val="single" w:sz="6" w:space="0" w:color="3B3B3B"/>
-              <w:right w:val="single" w:sz="6" w:space="0" w:color="3B3B3B"/>
-            </w:tcBorders>
-            <w:tcMar>
-              <w:top w:w="160" w:type="dxa"/>
-              <w:left w:w="200" w:type="dxa"/>
-              <w:bottom w:w="160" w:type="dxa"/>
-              <w:right w:w="200" w:type="dxa"/>
-            </w:tcMar>
-            <w:hideMark/>
-          </w:tcPr>
-          <w:p>
-            <w:pPr>
-              <w:keepNext/>
-              <w:keepLines/>
-              <w:rPr>
-                <w:rFonts w:ascii="Calibri" w:eastAsia="Times New Roman" w:hAnsi="Calibri" w:cs="Calibri"/>
-                <w:color w:val="3B3B3B"/>
-                <w:sz w:val="28"/>
-                <w:szCs w:val="28"/>
-              </w:rPr>
-            </w:pPr>
-            <w:r>
-              <w:rPr>
-                <w:rFonts w:ascii="Calibri" w:eastAsia="Times New Roman" w:hAnsi="Calibri" w:cs="Calibri"/>
-                <w:color w:val="3B3B3B"/>
-                <w:sz w:val="28"/>
-                <w:szCs w:val="28"/>
-              </w:rPr>
-              <w:t>Optional player resource: Job aid (PDF) — attach only when the file is the live public PDF. No URL on the slide until live.</w:t>
+              <w:left w:val="single" w:sz="12" w:space="0" w:color="3B3B3B"/>
+              <w:bottom w:val="single" w:sz="6" w:space="0" w:color="3B3B3B"/>
+              <w:right w:val="single" w:sz="6" w:space="0" w:color="3B3B3B"/>
+            </w:tcBorders>
+            <w:tcMar>
+              <w:top w:w="160" w:type="dxa"/>
+              <w:left w:w="200" w:type="dxa"/>
+              <w:bottom w:w="160" w:type="dxa"/>
+              <w:right w:w="200" w:type="dxa"/>
+            </w:tcMar>
+            <w:hideMark/>
+          </w:tcPr>
+          <w:p>
+            <w:pPr>
+              <w:keepNext/>
+              <w:keepLines/>
+              <w:rPr>
+                <w:rFonts w:ascii="Calibri" w:eastAsia="Times New Roman" w:hAnsi="Calibri" w:cs="Calibri"/>
+                <w:color w:val="3B3B3B"/>
+                <w:sz w:val="28"/>
+                <w:szCs w:val="28"/>
+              </w:rPr>
+            </w:pPr>
+            <w:r>
+              <w:rPr>
+                <w:rFonts w:ascii="Calibri" w:eastAsia="Times New Roman" w:hAnsi="Calibri" w:cs="Calibri"/>
+                <w:color w:val="3B3B3B"/>
+                <w:sz w:val="28"/>
+                <w:szCs w:val="28"/>
+              </w:rPr>
+              <w:t>Slide / block background: solid paper #FFFFFF.</w:t>
             </w:r>
           </w:p>
         </w:tc>
       </w:tr>
       <w:tr>
         <w:trPr>
-          <w:divId w:val="1631934933"/>
+          <w:divId w:val="1220555053"/>
           <w:cantSplit/>
         </w:trPr>
         <w:tc>
           <w:tcPr>
             <w:tcW w:w="2400" w:type="dxa"/>
             <w:tcBorders>
-              <w:top w:val="single" w:sz="6" w:space="0" w:color="3B3B3B"/>
+              <w:top w:val="single" w:sz="12" w:space="0" w:color="3B3B3B"/>
               <w:left w:val="single" w:sz="6" w:space="0" w:color="3B3B3B"/>
               <w:bottom w:val="single" w:sz="6" w:space="0" w:color="3B3B3B"/>
               <w:right w:val="single" w:sz="6" w:space="0" w:color="3B3B3B"/>
@@ -18864,7 +18771,7 @@
       </w:tr>
       <w:tr>
         <w:trPr>
-          <w:divId w:val="1631934933"/>
+          <w:divId w:val="1220555053"/>
           <w:cantSplit/>
         </w:trPr>
         <w:tc>
@@ -19003,6 +18910,14 @@
                 <w:szCs w:val="28"/>
               </w:rPr>
               <w:br/>
+            </w:r>
+            <w:r>
+              <w:rPr>
+                <w:rFonts w:ascii="Calibri" w:eastAsia="Times New Roman" w:hAnsi="Calibri" w:cs="Calibri"/>
+                <w:color w:val="3B3B3B"/>
+                <w:sz w:val="28"/>
+                <w:szCs w:val="28"/>
+              </w:rPr>
               <w:t>Finish</w:t>
             </w:r>
           </w:p>
@@ -19010,7 +18925,7 @@
       </w:tr>
       <w:tr>
         <w:trPr>
-          <w:divId w:val="1631934933"/>
+          <w:divId w:val="1220555053"/>
           <w:cantSplit/>
         </w:trPr>
         <w:tc>
@@ -19116,7 +19031,7 @@
       <w:pPr>
         <w:pStyle w:val="card-title"/>
         <w:keepLines/>
-        <w:divId w:val="108547651"/>
+        <w:divId w:val="1070809396"/>
         <w:rPr>
           <w:lang w:val="en"/>
         </w:rPr>
@@ -19125,6 +19040,7 @@
         <w:rPr>
           <w:lang w:val="en"/>
         </w:rPr>
+        <w:lastRenderedPageBreak/>
         <w:t>Storyline 360 · 3.2</w:t>
       </w:r>
     </w:p>
@@ -19146,7 +19062,7 @@
       </w:tblGrid>
       <w:tr>
         <w:trPr>
-          <w:divId w:val="108547651"/>
+          <w:divId w:val="1070809396"/>
           <w:cantSplit/>
         </w:trPr>
         <w:tc>
@@ -19228,14 +19144,14 @@
                 <w:sz w:val="28"/>
                 <w:szCs w:val="28"/>
               </w:rPr>
-              <w:t>Results slide. Hide Storyline Success / Failure headings if they appear. Variable reference for score. No certificate graphic.</w:t>
+              <w:t>Results slide. Score variable: %ScorePercent%.</w:t>
             </w:r>
           </w:p>
         </w:tc>
       </w:tr>
       <w:tr>
         <w:trPr>
-          <w:divId w:val="108547651"/>
+          <w:divId w:val="1070809396"/>
           <w:cantSplit/>
         </w:trPr>
         <w:tc>
@@ -19324,7 +19240,7 @@
       </w:tr>
       <w:tr>
         <w:trPr>
-          <w:divId w:val="108547651"/>
+          <w:divId w:val="1070809396"/>
           <w:cantSplit/>
         </w:trPr>
         <w:tc>
@@ -19461,7 +19377,7 @@
       </w:tr>
       <w:tr>
         <w:trPr>
-          <w:divId w:val="108547651"/>
+          <w:divId w:val="1070809396"/>
           <w:cantSplit/>
         </w:trPr>
         <w:tc>
@@ -19567,7 +19483,7 @@
       <w:pPr>
         <w:pStyle w:val="card-title"/>
         <w:keepLines/>
-        <w:divId w:val="725027457"/>
+        <w:divId w:val="550925420"/>
         <w:rPr>
           <w:lang w:val="en"/>
         </w:rPr>
@@ -19576,6 +19492,7 @@
         <w:rPr>
           <w:lang w:val="en"/>
         </w:rPr>
+        <w:lastRenderedPageBreak/>
         <w:t>Storyline 360 · M1</w:t>
       </w:r>
     </w:p>
@@ -19597,7 +19514,7 @@
       </w:tblGrid>
       <w:tr>
         <w:trPr>
-          <w:divId w:val="725027457"/>
+          <w:divId w:val="550925420"/>
           <w:cantSplit/>
         </w:trPr>
         <w:tc>
@@ -19679,14 +19596,14 @@
                 <w:sz w:val="28"/>
                 <w:szCs w:val="28"/>
               </w:rPr>
-              <w:t>Button state fills only. No extra words on states. Don’t wash is for incorrect feedback layers, not hover.</w:t>
+              <w:t>Button fills: paper (Normal), step wash (Hover), do wash (Selected), ink at 50% (Disabled), 1 px ink underline (Visited).</w:t>
             </w:r>
           </w:p>
         </w:tc>
       </w:tr>
       <w:tr>
         <w:trPr>
-          <w:divId w:val="725027457"/>
+          <w:divId w:val="550925420"/>
           <w:cantSplit/>
         </w:trPr>
         <w:tc>
@@ -19775,7 +19692,7 @@
       </w:tr>
       <w:tr>
         <w:trPr>
-          <w:divId w:val="725027457"/>
+          <w:divId w:val="550925420"/>
           <w:cantSplit/>
         </w:trPr>
         <w:tc>
@@ -19904,7 +19821,7 @@
       </w:tr>
       <w:tr>
         <w:trPr>
-          <w:divId w:val="725027457"/>
+          <w:divId w:val="550925420"/>
           <w:cantSplit/>
         </w:trPr>
         <w:tc>
@@ -20010,7 +19927,7 @@
       <w:pPr>
         <w:pStyle w:val="card-title"/>
         <w:keepLines/>
-        <w:divId w:val="1111894425"/>
+        <w:divId w:val="1761835005"/>
         <w:rPr>
           <w:lang w:val="en"/>
         </w:rPr>
@@ -20019,6 +19936,7 @@
         <w:rPr>
           <w:lang w:val="en"/>
         </w:rPr>
+        <w:lastRenderedPageBreak/>
         <w:t>Storyline 360 · M2</w:t>
       </w:r>
     </w:p>
@@ -20040,7 +19958,7 @@
       </w:tblGrid>
       <w:tr>
         <w:trPr>
-          <w:divId w:val="1111894425"/>
+          <w:divId w:val="1761835005"/>
           <w:cantSplit/>
         </w:trPr>
         <w:tc>
@@ -20122,14 +20040,14 @@
                 <w:sz w:val="28"/>
                 <w:szCs w:val="28"/>
               </w:rPr>
-              <w:t>Menu labels only. Layers are not in the menu.</w:t>
+              <w:t>Menu labels.</w:t>
             </w:r>
           </w:p>
         </w:tc>
       </w:tr>
       <w:tr>
         <w:trPr>
-          <w:divId w:val="1111894425"/>
+          <w:divId w:val="1761835005"/>
           <w:cantSplit/>
         </w:trPr>
         <w:tc>
@@ -20218,7 +20136,7 @@
       </w:tr>
       <w:tr>
         <w:trPr>
-          <w:divId w:val="1111894425"/>
+          <w:divId w:val="1761835005"/>
           <w:cantSplit/>
         </w:trPr>
         <w:tc>
@@ -20330,6 +20248,14 @@
                 <w:szCs w:val="28"/>
               </w:rPr>
               <w:br/>
+            </w:r>
+            <w:r>
+              <w:rPr>
+                <w:rFonts w:ascii="Calibri" w:eastAsia="Times New Roman" w:hAnsi="Calibri" w:cs="Calibri"/>
+                <w:color w:val="3B3B3B"/>
+                <w:sz w:val="28"/>
+                <w:szCs w:val="28"/>
+              </w:rPr>
               <w:t>Jordan — don’t paste</w:t>
             </w:r>
             <w:r>
@@ -20417,7 +20343,7 @@
       </w:tr>
       <w:tr>
         <w:trPr>
-          <w:divId w:val="1111894425"/>
+          <w:divId w:val="1761835005"/>
           <w:cantSplit/>
         </w:trPr>
         <w:tc>
@@ -20523,7 +20449,7 @@
       <w:pPr>
         <w:pStyle w:val="card-title"/>
         <w:keepLines/>
-        <w:divId w:val="732898465"/>
+        <w:divId w:val="1456022244"/>
         <w:rPr>
           <w:lang w:val="en"/>
         </w:rPr>
@@ -20532,6 +20458,7 @@
         <w:rPr>
           <w:lang w:val="en"/>
         </w:rPr>
+        <w:lastRenderedPageBreak/>
         <w:t>Storyline 360 · M3</w:t>
       </w:r>
     </w:p>
@@ -20553,7 +20480,7 @@
       </w:tblGrid>
       <w:tr>
         <w:trPr>
-          <w:divId w:val="732898465"/>
+          <w:divId w:val="1456022244"/>
           <w:cantSplit/>
         </w:trPr>
         <w:tc>
@@ -20635,14 +20562,14 @@
                 <w:sz w:val="28"/>
                 <w:szCs w:val="28"/>
               </w:rPr>
-              <w:t>No extra visible type. Screen-reader names match visible labels.</w:t>
+              <w:t>Screen-reader names, matching the visible labels.</w:t>
             </w:r>
           </w:p>
         </w:tc>
       </w:tr>
       <w:tr>
         <w:trPr>
-          <w:divId w:val="732898465"/>
+          <w:divId w:val="1456022244"/>
           <w:cantSplit/>
         </w:trPr>
         <w:tc>
@@ -20731,7 +20658,7 @@
       </w:tr>
       <w:tr>
         <w:trPr>
-          <w:divId w:val="732898465"/>
+          <w:divId w:val="1456022244"/>
           <w:cantSplit/>
         </w:trPr>
         <w:tc>
@@ -20843,6 +20770,14 @@
                 <w:szCs w:val="28"/>
               </w:rPr>
               <w:br/>
+            </w:r>
+            <w:r>
+              <w:rPr>
+                <w:rFonts w:ascii="Calibri" w:eastAsia="Times New Roman" w:hAnsi="Calibri" w:cs="Calibri"/>
+                <w:color w:val="3B3B3B"/>
+                <w:sz w:val="28"/>
+                <w:szCs w:val="28"/>
+              </w:rPr>
               <w:t>Public AI is fine if you delete the chat afterwards.</w:t>
             </w:r>
             <w:r>
@@ -20960,7 +20895,7 @@
       </w:tr>
       <w:tr>
         <w:trPr>
-          <w:divId w:val="732898465"/>
+          <w:divId w:val="1456022244"/>
           <w:cantSplit/>
         </w:trPr>
         <w:tc>
@@ -21168,7 +21103,7 @@
         <w:color w:val="3B3B3B"/>
         <w:sz w:val="28"/>
       </w:rPr>
-      <w:t>1</w:t>
+      <w:t>31</w:t>
     </w:r>
     <w:r>
       <w:rPr>
@@ -21243,7 +21178,7 @@
         <w:color w:val="3B3B3B"/>
         <w:sz w:val="28"/>
       </w:rPr>
-      <w:t>3</w:t>
+      <w:t>31</w:t>
     </w:r>
     <w:r>
       <w:rPr>
@@ -22195,7 +22130,7 @@
     <w:link w:val="HeaderChar"/>
     <w:uiPriority w:val="99"/>
     <w:unhideWhenUsed/>
-    <w:rsid w:val="00BF1B33"/>
+    <w:rsid w:val="00BC0818"/>
     <w:pPr>
       <w:tabs>
         <w:tab w:val="center" w:pos="4680"/>
@@ -22208,7 +22143,7 @@
     <w:basedOn w:val="DefaultParagraphFont"/>
     <w:link w:val="Header"/>
     <w:uiPriority w:val="99"/>
-    <w:rsid w:val="00BF1B33"/>
+    <w:rsid w:val="00BC0818"/>
     <w:rPr>
       <w:rFonts w:eastAsiaTheme="minorEastAsia"/>
       <w:sz w:val="24"/>
@@ -22221,7 +22156,7 @@
     <w:link w:val="FooterChar"/>
     <w:uiPriority w:val="99"/>
     <w:unhideWhenUsed/>
-    <w:rsid w:val="00BF1B33"/>
+    <w:rsid w:val="00BC0818"/>
     <w:pPr>
       <w:tabs>
         <w:tab w:val="center" w:pos="4680"/>
@@ -22234,7 +22169,7 @@
     <w:basedOn w:val="DefaultParagraphFont"/>
     <w:link w:val="Footer"/>
     <w:uiPriority w:val="99"/>
-    <w:rsid w:val="00BF1B33"/>
+    <w:rsid w:val="00BC0818"/>
     <w:rPr>
       <w:rFonts w:eastAsiaTheme="minorEastAsia"/>
       <w:sz w:val="24"/>

</xml_diff>